<commit_message>
docs: add manual RAG evaluation results for 5 test questions
</commit_message>
<xml_diff>
--- a/AI Software Development Internship.docx
+++ b/AI Software Development Internship.docx
@@ -794,19 +794,128 @@
           <w:rFonts w:ascii="Times New Roman" w:hAnsi="Times New Roman"/>
           <w:b/>
           <w:bCs/>
-          <w:sz w:val="28"/>
-          <w:szCs w:val="28"/>
-        </w:rPr>
-      </w:pPr>
-      <w:r>
-        <w:rPr>
-          <w:rFonts w:ascii="Times New Roman" w:hAnsi="Times New Roman"/>
-          <w:b/>
-          <w:bCs/>
-          <w:sz w:val="28"/>
-          <w:szCs w:val="28"/>
+          <w:sz w:val="32"/>
+          <w:szCs w:val="32"/>
+        </w:rPr>
+      </w:pPr>
+      <w:r>
+        <w:rPr>
+          <w:rFonts w:ascii="Times New Roman" w:hAnsi="Times New Roman"/>
+          <w:b/>
+          <w:bCs/>
+          <w:sz w:val="32"/>
+          <w:szCs w:val="32"/>
         </w:rPr>
         <w:lastRenderedPageBreak/>
+        <w:t>Practice:</w:t>
+      </w:r>
+    </w:p>
+    <w:p>
+      <w:pPr>
+        <w:pStyle w:val="ListParagraph"/>
+        <w:numPr>
+          <w:ilvl w:val="0"/>
+          <w:numId w:val="3"/>
+        </w:numPr>
+        <w:spacing w:line="360" w:lineRule="auto"/>
+        <w:rPr>
+          <w:rFonts w:ascii="Times New Roman" w:hAnsi="Times New Roman"/>
+          <w:sz w:val="28"/>
+          <w:szCs w:val="28"/>
+        </w:rPr>
+      </w:pPr>
+      <w:r>
+        <w:rPr>
+          <w:rFonts w:ascii="Times New Roman" w:hAnsi="Times New Roman"/>
+          <w:sz w:val="28"/>
+          <w:szCs w:val="28"/>
+        </w:rPr>
+        <w:t xml:space="preserve">Run the script above and confirm the space-related query returns the science fiction book first. </w:t>
+      </w:r>
+    </w:p>
+    <w:p>
+      <w:pPr>
+        <w:pStyle w:val="ListParagraph"/>
+        <w:numPr>
+          <w:ilvl w:val="0"/>
+          <w:numId w:val="3"/>
+        </w:numPr>
+        <w:spacing w:line="360" w:lineRule="auto"/>
+        <w:rPr>
+          <w:rFonts w:ascii="Times New Roman" w:hAnsi="Times New Roman"/>
+          <w:sz w:val="28"/>
+          <w:szCs w:val="28"/>
+        </w:rPr>
+      </w:pPr>
+      <w:r>
+        <w:rPr>
+          <w:rFonts w:ascii="Times New Roman" w:hAnsi="Times New Roman"/>
+          <w:sz w:val="28"/>
+          <w:szCs w:val="28"/>
+        </w:rPr>
+        <w:t>Add a metadata filter to the query (where</w:t>
+      </w:r>
+      <w:proofErr w:type="gramStart"/>
+      <w:r>
+        <w:rPr>
+          <w:rFonts w:ascii="Times New Roman" w:hAnsi="Times New Roman"/>
+          <w:sz w:val="28"/>
+          <w:szCs w:val="28"/>
+        </w:rPr>
+        <w:t>={</w:t>
+      </w:r>
+      <w:proofErr w:type="gramEnd"/>
+      <w:r>
+        <w:rPr>
+          <w:rFonts w:ascii="Times New Roman" w:hAnsi="Times New Roman"/>
+          <w:sz w:val="28"/>
+          <w:szCs w:val="28"/>
+        </w:rPr>
+        <w:t xml:space="preserve">"category": "Fantasy"}) and confirm it only searches within that category. </w:t>
+      </w:r>
+    </w:p>
+    <w:p>
+      <w:pPr>
+        <w:pStyle w:val="ListParagraph"/>
+        <w:numPr>
+          <w:ilvl w:val="0"/>
+          <w:numId w:val="3"/>
+        </w:numPr>
+        <w:spacing w:line="360" w:lineRule="auto"/>
+        <w:rPr>
+          <w:rFonts w:ascii="Times New Roman" w:hAnsi="Times New Roman"/>
+          <w:sz w:val="28"/>
+          <w:szCs w:val="28"/>
+        </w:rPr>
+      </w:pPr>
+      <w:r>
+        <w:rPr>
+          <w:rFonts w:ascii="Times New Roman" w:hAnsi="Times New Roman"/>
+          <w:sz w:val="28"/>
+          <w:szCs w:val="28"/>
+        </w:rPr>
+        <w:t>Add two more documents of your own and re-run a few queries to get comfortable with the add/query pattern.</w:t>
+      </w:r>
+    </w:p>
+    <w:p>
+      <w:pPr>
+        <w:spacing w:line="360" w:lineRule="auto"/>
+        <w:rPr>
+          <w:rFonts w:ascii="Times New Roman" w:hAnsi="Times New Roman"/>
+          <w:b/>
+          <w:bCs/>
+          <w:sz w:val="28"/>
+          <w:szCs w:val="28"/>
+        </w:rPr>
+      </w:pPr>
+      <w:r>
+        <w:rPr>
+          <w:rFonts w:ascii="Times New Roman" w:hAnsi="Times New Roman"/>
+          <w:b/>
+          <w:bCs/>
+          <w:sz w:val="28"/>
+          <w:szCs w:val="28"/>
+        </w:rPr>
         <w:t>Code:</w:t>
       </w:r>
     </w:p>
@@ -823,6 +932,166 @@
       </w:pPr>
       <w:r>
         <w:rPr>
+          <w:noProof/>
+          <w14:ligatures w14:val="standardContextual"/>
+        </w:rPr>
+        <w:drawing>
+          <wp:inline distT="0" distB="0" distL="0" distR="0" wp14:anchorId="6E6599D7" wp14:editId="274B50A6">
+            <wp:extent cx="5731510" cy="4307205"/>
+            <wp:effectExtent l="0" t="0" r="2540" b="0"/>
+            <wp:docPr id="308410403" name="Picture 1"/>
+            <wp:cNvGraphicFramePr>
+              <a:graphicFrameLocks xmlns:a="http://schemas.openxmlformats.org/drawingml/2006/main" noChangeAspect="1"/>
+            </wp:cNvGraphicFramePr>
+            <a:graphic xmlns:a="http://schemas.openxmlformats.org/drawingml/2006/main">
+              <a:graphicData uri="http://schemas.openxmlformats.org/drawingml/2006/picture">
+                <pic:pic xmlns:pic="http://schemas.openxmlformats.org/drawingml/2006/picture">
+                  <pic:nvPicPr>
+                    <pic:cNvPr id="308410403" name=""/>
+                    <pic:cNvPicPr/>
+                  </pic:nvPicPr>
+                  <pic:blipFill>
+                    <a:blip r:embed="rId8"/>
+                    <a:stretch>
+                      <a:fillRect/>
+                    </a:stretch>
+                  </pic:blipFill>
+                  <pic:spPr>
+                    <a:xfrm>
+                      <a:off x="0" y="0"/>
+                      <a:ext cx="5731510" cy="4307205"/>
+                    </a:xfrm>
+                    <a:prstGeom prst="rect">
+                      <a:avLst/>
+                    </a:prstGeom>
+                  </pic:spPr>
+                </pic:pic>
+              </a:graphicData>
+            </a:graphic>
+          </wp:inline>
+        </w:drawing>
+      </w:r>
+    </w:p>
+    <w:p>
+      <w:pPr>
+        <w:spacing w:line="360" w:lineRule="auto"/>
+        <w:rPr>
+          <w:rFonts w:ascii="Times New Roman" w:hAnsi="Times New Roman"/>
+          <w:b/>
+          <w:bCs/>
+          <w:sz w:val="28"/>
+          <w:szCs w:val="28"/>
+        </w:rPr>
+      </w:pPr>
+      <w:r>
+        <w:rPr>
+          <w:noProof/>
+          <w14:ligatures w14:val="standardContextual"/>
+        </w:rPr>
+        <w:lastRenderedPageBreak/>
+        <w:drawing>
+          <wp:inline distT="0" distB="0" distL="0" distR="0" wp14:anchorId="6CBA601D" wp14:editId="74736B95">
+            <wp:extent cx="5731510" cy="3874135"/>
+            <wp:effectExtent l="0" t="0" r="2540" b="0"/>
+            <wp:docPr id="476459050" name="Picture 1"/>
+            <wp:cNvGraphicFramePr>
+              <a:graphicFrameLocks xmlns:a="http://schemas.openxmlformats.org/drawingml/2006/main" noChangeAspect="1"/>
+            </wp:cNvGraphicFramePr>
+            <a:graphic xmlns:a="http://schemas.openxmlformats.org/drawingml/2006/main">
+              <a:graphicData uri="http://schemas.openxmlformats.org/drawingml/2006/picture">
+                <pic:pic xmlns:pic="http://schemas.openxmlformats.org/drawingml/2006/picture">
+                  <pic:nvPicPr>
+                    <pic:cNvPr id="476459050" name=""/>
+                    <pic:cNvPicPr/>
+                  </pic:nvPicPr>
+                  <pic:blipFill>
+                    <a:blip r:embed="rId9"/>
+                    <a:stretch>
+                      <a:fillRect/>
+                    </a:stretch>
+                  </pic:blipFill>
+                  <pic:spPr>
+                    <a:xfrm>
+                      <a:off x="0" y="0"/>
+                      <a:ext cx="5731510" cy="3874135"/>
+                    </a:xfrm>
+                    <a:prstGeom prst="rect">
+                      <a:avLst/>
+                    </a:prstGeom>
+                  </pic:spPr>
+                </pic:pic>
+              </a:graphicData>
+            </a:graphic>
+          </wp:inline>
+        </w:drawing>
+      </w:r>
+    </w:p>
+    <w:p>
+      <w:pPr>
+        <w:spacing w:line="360" w:lineRule="auto"/>
+        <w:rPr>
+          <w:rFonts w:ascii="Times New Roman" w:hAnsi="Times New Roman"/>
+          <w:b/>
+          <w:bCs/>
+          <w:sz w:val="28"/>
+          <w:szCs w:val="28"/>
+        </w:rPr>
+      </w:pPr>
+      <w:r>
+        <w:rPr>
+          <w:noProof/>
+          <w14:ligatures w14:val="standardContextual"/>
+        </w:rPr>
+        <w:drawing>
+          <wp:inline distT="0" distB="0" distL="0" distR="0" wp14:anchorId="199B2A0F" wp14:editId="239D0173">
+            <wp:extent cx="5731510" cy="1859280"/>
+            <wp:effectExtent l="0" t="0" r="2540" b="7620"/>
+            <wp:docPr id="219404109" name="Picture 1"/>
+            <wp:cNvGraphicFramePr>
+              <a:graphicFrameLocks xmlns:a="http://schemas.openxmlformats.org/drawingml/2006/main" noChangeAspect="1"/>
+            </wp:cNvGraphicFramePr>
+            <a:graphic xmlns:a="http://schemas.openxmlformats.org/drawingml/2006/main">
+              <a:graphicData uri="http://schemas.openxmlformats.org/drawingml/2006/picture">
+                <pic:pic xmlns:pic="http://schemas.openxmlformats.org/drawingml/2006/picture">
+                  <pic:nvPicPr>
+                    <pic:cNvPr id="219404109" name=""/>
+                    <pic:cNvPicPr/>
+                  </pic:nvPicPr>
+                  <pic:blipFill>
+                    <a:blip r:embed="rId10"/>
+                    <a:stretch>
+                      <a:fillRect/>
+                    </a:stretch>
+                  </pic:blipFill>
+                  <pic:spPr>
+                    <a:xfrm>
+                      <a:off x="0" y="0"/>
+                      <a:ext cx="5731510" cy="1859280"/>
+                    </a:xfrm>
+                    <a:prstGeom prst="rect">
+                      <a:avLst/>
+                    </a:prstGeom>
+                  </pic:spPr>
+                </pic:pic>
+              </a:graphicData>
+            </a:graphic>
+          </wp:inline>
+        </w:drawing>
+      </w:r>
+    </w:p>
+    <w:p>
+      <w:pPr>
+        <w:spacing w:line="360" w:lineRule="auto"/>
+        <w:rPr>
+          <w:rFonts w:ascii="Times New Roman" w:hAnsi="Times New Roman"/>
+          <w:b/>
+          <w:bCs/>
+          <w:sz w:val="28"/>
+          <w:szCs w:val="28"/>
+        </w:rPr>
+      </w:pPr>
+      <w:r>
+        <w:rPr>
           <w:rFonts w:ascii="Times New Roman" w:hAnsi="Times New Roman"/>
           <w:b/>
           <w:bCs/>
@@ -837,12 +1106,1098 @@
         <w:spacing w:line="360" w:lineRule="auto"/>
         <w:rPr>
           <w:rFonts w:ascii="Times New Roman" w:hAnsi="Times New Roman"/>
-          <w:b/>
-          <w:bCs/>
-          <w:sz w:val="28"/>
-          <w:szCs w:val="28"/>
-        </w:rPr>
-      </w:pPr>
+        </w:rPr>
+      </w:pPr>
+      <w:r>
+        <w:rPr>
+          <w:rFonts w:ascii="Times New Roman" w:hAnsi="Times New Roman"/>
+        </w:rPr>
+        <w:t>Task 1: Semantic Vector Search</w:t>
+      </w:r>
+    </w:p>
+    <w:p>
+      <w:pPr>
+        <w:spacing w:line="360" w:lineRule="auto"/>
+        <w:rPr>
+          <w:rFonts w:ascii="Times New Roman" w:hAnsi="Times New Roman"/>
+        </w:rPr>
+      </w:pPr>
+      <w:r>
+        <w:rPr>
+          <w:rFonts w:ascii="Times New Roman" w:hAnsi="Times New Roman"/>
+        </w:rPr>
+        <w:t>T</w:t>
+      </w:r>
+      <w:r>
+        <w:rPr>
+          <w:rFonts w:ascii="Times New Roman" w:hAnsi="Times New Roman"/>
+        </w:rPr>
+        <w:t>ask 2: Metadata Filtering</w:t>
+      </w:r>
+    </w:p>
+    <w:p>
+      <w:pPr>
+        <w:spacing w:line="360" w:lineRule="auto"/>
+        <w:rPr>
+          <w:rFonts w:ascii="Times New Roman" w:hAnsi="Times New Roman"/>
+        </w:rPr>
+      </w:pPr>
+      <w:r>
+        <w:rPr>
+          <w:rFonts w:ascii="Times New Roman" w:hAnsi="Times New Roman"/>
+        </w:rPr>
+        <w:t>Task 3: Add Two More Documents</w:t>
+      </w:r>
+    </w:p>
+    <w:p>
+      <w:pPr>
+        <w:spacing w:line="360" w:lineRule="auto"/>
+        <w:rPr>
+          <w:rFonts w:ascii="Times New Roman" w:hAnsi="Times New Roman"/>
+          <w:b/>
+          <w:bCs/>
+          <w:sz w:val="28"/>
+          <w:szCs w:val="28"/>
+        </w:rPr>
+      </w:pPr>
+      <w:r>
+        <w:rPr>
+          <w:noProof/>
+          <w14:ligatures w14:val="standardContextual"/>
+        </w:rPr>
+        <w:lastRenderedPageBreak/>
+        <w:drawing>
+          <wp:inline distT="0" distB="0" distL="0" distR="0" wp14:anchorId="5C5C93DF" wp14:editId="512BC446">
+            <wp:extent cx="5731510" cy="1799112"/>
+            <wp:effectExtent l="0" t="0" r="2540" b="0"/>
+            <wp:docPr id="334213662" name="Picture 1"/>
+            <wp:cNvGraphicFramePr>
+              <a:graphicFrameLocks xmlns:a="http://schemas.openxmlformats.org/drawingml/2006/main" noChangeAspect="1"/>
+            </wp:cNvGraphicFramePr>
+            <a:graphic xmlns:a="http://schemas.openxmlformats.org/drawingml/2006/main">
+              <a:graphicData uri="http://schemas.openxmlformats.org/drawingml/2006/picture">
+                <pic:pic xmlns:pic="http://schemas.openxmlformats.org/drawingml/2006/picture">
+                  <pic:nvPicPr>
+                    <pic:cNvPr id="334213662" name=""/>
+                    <pic:cNvPicPr/>
+                  </pic:nvPicPr>
+                  <pic:blipFill>
+                    <a:blip r:embed="rId11"/>
+                    <a:stretch>
+                      <a:fillRect/>
+                    </a:stretch>
+                  </pic:blipFill>
+                  <pic:spPr>
+                    <a:xfrm>
+                      <a:off x="0" y="0"/>
+                      <a:ext cx="5735199" cy="1800270"/>
+                    </a:xfrm>
+                    <a:prstGeom prst="rect">
+                      <a:avLst/>
+                    </a:prstGeom>
+                  </pic:spPr>
+                </pic:pic>
+              </a:graphicData>
+            </a:graphic>
+          </wp:inline>
+        </w:drawing>
+      </w:r>
+    </w:p>
+    <w:p>
+      <w:pPr>
+        <w:spacing w:line="360" w:lineRule="auto"/>
+        <w:jc w:val="center"/>
+        <w:rPr>
+          <w:rFonts w:ascii="Times New Roman" w:hAnsi="Times New Roman"/>
+          <w:b/>
+          <w:bCs/>
+          <w:sz w:val="32"/>
+          <w:szCs w:val="32"/>
+        </w:rPr>
+      </w:pPr>
+      <w:r>
+        <w:rPr>
+          <w:rFonts w:ascii="Times New Roman" w:hAnsi="Times New Roman"/>
+          <w:b/>
+          <w:bCs/>
+          <w:sz w:val="32"/>
+          <w:szCs w:val="32"/>
+        </w:rPr>
+        <w:t>PART C — RAG FUNDAMENTALS: BUILDING THE PIPELINE BY HAND</w:t>
+      </w:r>
+    </w:p>
+    <w:p>
+      <w:pPr>
+        <w:spacing w:line="360" w:lineRule="auto"/>
+        <w:rPr>
+          <w:rFonts w:ascii="Times New Roman" w:hAnsi="Times New Roman"/>
+          <w:b/>
+          <w:bCs/>
+          <w:sz w:val="28"/>
+          <w:szCs w:val="28"/>
+        </w:rPr>
+      </w:pPr>
+      <w:r>
+        <w:rPr>
+          <w:rFonts w:ascii="Times New Roman" w:hAnsi="Times New Roman"/>
+          <w:b/>
+          <w:bCs/>
+          <w:sz w:val="28"/>
+          <w:szCs w:val="28"/>
+        </w:rPr>
+        <w:t>Practice:</w:t>
+      </w:r>
+    </w:p>
+    <w:p>
+      <w:pPr>
+        <w:pStyle w:val="ListParagraph"/>
+        <w:numPr>
+          <w:ilvl w:val="0"/>
+          <w:numId w:val="4"/>
+        </w:numPr>
+        <w:spacing w:line="360" w:lineRule="auto"/>
+        <w:jc w:val="both"/>
+        <w:rPr>
+          <w:rFonts w:ascii="Times New Roman" w:hAnsi="Times New Roman"/>
+          <w:sz w:val="28"/>
+          <w:szCs w:val="28"/>
+        </w:rPr>
+      </w:pPr>
+      <w:r>
+        <w:rPr>
+          <w:rFonts w:ascii="Times New Roman" w:hAnsi="Times New Roman"/>
+          <w:sz w:val="28"/>
+          <w:szCs w:val="28"/>
+        </w:rPr>
+        <w:t xml:space="preserve">Add 3–4 short text documents (a couple of paragraphs each, any topic you like) using </w:t>
+      </w:r>
+      <w:proofErr w:type="spellStart"/>
+      <w:r>
+        <w:rPr>
+          <w:rFonts w:ascii="Times New Roman" w:hAnsi="Times New Roman"/>
+          <w:sz w:val="28"/>
+          <w:szCs w:val="28"/>
+        </w:rPr>
+        <w:t>add_</w:t>
+      </w:r>
+      <w:proofErr w:type="gramStart"/>
+      <w:r>
+        <w:rPr>
+          <w:rFonts w:ascii="Times New Roman" w:hAnsi="Times New Roman"/>
+          <w:sz w:val="28"/>
+          <w:szCs w:val="28"/>
+        </w:rPr>
+        <w:t>document</w:t>
+      </w:r>
+      <w:proofErr w:type="spellEnd"/>
+      <w:r>
+        <w:rPr>
+          <w:rFonts w:ascii="Times New Roman" w:hAnsi="Times New Roman"/>
+          <w:sz w:val="28"/>
+          <w:szCs w:val="28"/>
+        </w:rPr>
+        <w:t>(</w:t>
+      </w:r>
+      <w:proofErr w:type="gramEnd"/>
+      <w:r>
+        <w:rPr>
+          <w:rFonts w:ascii="Times New Roman" w:hAnsi="Times New Roman"/>
+          <w:sz w:val="28"/>
+          <w:szCs w:val="28"/>
+        </w:rPr>
+        <w:t xml:space="preserve">). </w:t>
+      </w:r>
+    </w:p>
+    <w:p>
+      <w:pPr>
+        <w:pStyle w:val="ListParagraph"/>
+        <w:numPr>
+          <w:ilvl w:val="0"/>
+          <w:numId w:val="4"/>
+        </w:numPr>
+        <w:spacing w:line="360" w:lineRule="auto"/>
+        <w:jc w:val="both"/>
+        <w:rPr>
+          <w:rFonts w:ascii="Times New Roman" w:hAnsi="Times New Roman"/>
+          <w:sz w:val="28"/>
+          <w:szCs w:val="28"/>
+        </w:rPr>
+      </w:pPr>
+      <w:r>
+        <w:rPr>
+          <w:rFonts w:ascii="Times New Roman" w:hAnsi="Times New Roman"/>
+          <w:sz w:val="28"/>
+          <w:szCs w:val="28"/>
+        </w:rPr>
+        <w:t xml:space="preserve">Ask a question clearly answerable from one of the documents and confirm the retrieved chunks and the final answer both make sense. </w:t>
+      </w:r>
+    </w:p>
+    <w:p>
+      <w:pPr>
+        <w:pStyle w:val="ListParagraph"/>
+        <w:numPr>
+          <w:ilvl w:val="0"/>
+          <w:numId w:val="4"/>
+        </w:numPr>
+        <w:spacing w:line="360" w:lineRule="auto"/>
+        <w:jc w:val="both"/>
+        <w:rPr>
+          <w:rFonts w:ascii="Times New Roman" w:hAnsi="Times New Roman"/>
+          <w:sz w:val="28"/>
+          <w:szCs w:val="28"/>
+        </w:rPr>
+      </w:pPr>
+      <w:r>
+        <w:rPr>
+          <w:rFonts w:ascii="Times New Roman" w:hAnsi="Times New Roman"/>
+          <w:sz w:val="28"/>
+          <w:szCs w:val="28"/>
+        </w:rPr>
+        <w:t xml:space="preserve">Ask a question that has nothing to do with any of your documents and confirm the model says it doesn't know, instead of making something up. </w:t>
+      </w:r>
+    </w:p>
+    <w:p>
+      <w:pPr>
+        <w:pStyle w:val="ListParagraph"/>
+        <w:numPr>
+          <w:ilvl w:val="0"/>
+          <w:numId w:val="4"/>
+        </w:numPr>
+        <w:spacing w:line="360" w:lineRule="auto"/>
+        <w:jc w:val="both"/>
+        <w:rPr>
+          <w:rFonts w:ascii="Times New Roman" w:hAnsi="Times New Roman"/>
+          <w:sz w:val="28"/>
+          <w:szCs w:val="28"/>
+        </w:rPr>
+      </w:pPr>
+      <w:r>
+        <w:rPr>
+          <w:rFonts w:ascii="Times New Roman" w:hAnsi="Times New Roman"/>
+          <w:sz w:val="28"/>
+          <w:szCs w:val="28"/>
+        </w:rPr>
+        <w:t>Print the source metadata for each retrieved chunk alongside the answer — this is your source attribution.</w:t>
+      </w:r>
+    </w:p>
+    <w:p>
+      <w:pPr>
+        <w:spacing w:line="360" w:lineRule="auto"/>
+        <w:rPr>
+          <w:rFonts w:ascii="Times New Roman" w:hAnsi="Times New Roman"/>
+          <w:b/>
+          <w:bCs/>
+          <w:sz w:val="28"/>
+          <w:szCs w:val="28"/>
+        </w:rPr>
+      </w:pPr>
+      <w:r>
+        <w:rPr>
+          <w:rFonts w:ascii="Times New Roman" w:hAnsi="Times New Roman"/>
+          <w:b/>
+          <w:bCs/>
+          <w:sz w:val="28"/>
+          <w:szCs w:val="28"/>
+        </w:rPr>
+        <w:t>Code:</w:t>
+      </w:r>
+    </w:p>
+    <w:p>
+      <w:pPr>
+        <w:spacing w:line="360" w:lineRule="auto"/>
+        <w:rPr>
+          <w:rFonts w:ascii="Times New Roman" w:hAnsi="Times New Roman"/>
+          <w:b/>
+          <w:bCs/>
+          <w:sz w:val="28"/>
+          <w:szCs w:val="28"/>
+        </w:rPr>
+      </w:pPr>
+      <w:r>
+        <w:rPr>
+          <w:noProof/>
+          <w14:ligatures w14:val="standardContextual"/>
+        </w:rPr>
+        <w:lastRenderedPageBreak/>
+        <w:drawing>
+          <wp:inline distT="0" distB="0" distL="0" distR="0" wp14:anchorId="146FD173" wp14:editId="00DF7C37">
+            <wp:extent cx="5731510" cy="4290695"/>
+            <wp:effectExtent l="0" t="0" r="2540" b="0"/>
+            <wp:docPr id="2036100125" name="Picture 1"/>
+            <wp:cNvGraphicFramePr>
+              <a:graphicFrameLocks xmlns:a="http://schemas.openxmlformats.org/drawingml/2006/main" noChangeAspect="1"/>
+            </wp:cNvGraphicFramePr>
+            <a:graphic xmlns:a="http://schemas.openxmlformats.org/drawingml/2006/main">
+              <a:graphicData uri="http://schemas.openxmlformats.org/drawingml/2006/picture">
+                <pic:pic xmlns:pic="http://schemas.openxmlformats.org/drawingml/2006/picture">
+                  <pic:nvPicPr>
+                    <pic:cNvPr id="2036100125" name=""/>
+                    <pic:cNvPicPr/>
+                  </pic:nvPicPr>
+                  <pic:blipFill>
+                    <a:blip r:embed="rId12"/>
+                    <a:stretch>
+                      <a:fillRect/>
+                    </a:stretch>
+                  </pic:blipFill>
+                  <pic:spPr>
+                    <a:xfrm>
+                      <a:off x="0" y="0"/>
+                      <a:ext cx="5731510" cy="4290695"/>
+                    </a:xfrm>
+                    <a:prstGeom prst="rect">
+                      <a:avLst/>
+                    </a:prstGeom>
+                  </pic:spPr>
+                </pic:pic>
+              </a:graphicData>
+            </a:graphic>
+          </wp:inline>
+        </w:drawing>
+      </w:r>
+    </w:p>
+    <w:p>
+      <w:pPr>
+        <w:spacing w:line="360" w:lineRule="auto"/>
+        <w:rPr>
+          <w:rFonts w:ascii="Times New Roman" w:hAnsi="Times New Roman"/>
+          <w:b/>
+          <w:bCs/>
+          <w:sz w:val="28"/>
+          <w:szCs w:val="28"/>
+        </w:rPr>
+      </w:pPr>
+      <w:r>
+        <w:rPr>
+          <w:noProof/>
+          <w14:ligatures w14:val="standardContextual"/>
+        </w:rPr>
+        <w:lastRenderedPageBreak/>
+        <w:drawing>
+          <wp:inline distT="0" distB="0" distL="0" distR="0" wp14:anchorId="7EA3CF6A" wp14:editId="15B8A12E">
+            <wp:extent cx="5731510" cy="4899704"/>
+            <wp:effectExtent l="0" t="0" r="2540" b="0"/>
+            <wp:docPr id="436447660" name="Picture 1"/>
+            <wp:cNvGraphicFramePr>
+              <a:graphicFrameLocks xmlns:a="http://schemas.openxmlformats.org/drawingml/2006/main" noChangeAspect="1"/>
+            </wp:cNvGraphicFramePr>
+            <a:graphic xmlns:a="http://schemas.openxmlformats.org/drawingml/2006/main">
+              <a:graphicData uri="http://schemas.openxmlformats.org/drawingml/2006/picture">
+                <pic:pic xmlns:pic="http://schemas.openxmlformats.org/drawingml/2006/picture">
+                  <pic:nvPicPr>
+                    <pic:cNvPr id="436447660" name=""/>
+                    <pic:cNvPicPr/>
+                  </pic:nvPicPr>
+                  <pic:blipFill>
+                    <a:blip r:embed="rId13"/>
+                    <a:stretch>
+                      <a:fillRect/>
+                    </a:stretch>
+                  </pic:blipFill>
+                  <pic:spPr>
+                    <a:xfrm>
+                      <a:off x="0" y="0"/>
+                      <a:ext cx="5733392" cy="4901313"/>
+                    </a:xfrm>
+                    <a:prstGeom prst="rect">
+                      <a:avLst/>
+                    </a:prstGeom>
+                  </pic:spPr>
+                </pic:pic>
+              </a:graphicData>
+            </a:graphic>
+          </wp:inline>
+        </w:drawing>
+      </w:r>
+    </w:p>
+    <w:p>
+      <w:pPr>
+        <w:spacing w:line="360" w:lineRule="auto"/>
+        <w:rPr>
+          <w:rFonts w:ascii="Times New Roman" w:hAnsi="Times New Roman"/>
+          <w:b/>
+          <w:bCs/>
+          <w:sz w:val="28"/>
+          <w:szCs w:val="28"/>
+        </w:rPr>
+      </w:pPr>
+      <w:r>
+        <w:rPr>
+          <w:noProof/>
+          <w14:ligatures w14:val="standardContextual"/>
+        </w:rPr>
+        <w:drawing>
+          <wp:inline distT="0" distB="0" distL="0" distR="0" wp14:anchorId="38F5C358" wp14:editId="2894F846">
+            <wp:extent cx="5731111" cy="3673457"/>
+            <wp:effectExtent l="0" t="0" r="3175" b="3810"/>
+            <wp:docPr id="1841705744" name="Picture 1"/>
+            <wp:cNvGraphicFramePr>
+              <a:graphicFrameLocks xmlns:a="http://schemas.openxmlformats.org/drawingml/2006/main" noChangeAspect="1"/>
+            </wp:cNvGraphicFramePr>
+            <a:graphic xmlns:a="http://schemas.openxmlformats.org/drawingml/2006/main">
+              <a:graphicData uri="http://schemas.openxmlformats.org/drawingml/2006/picture">
+                <pic:pic xmlns:pic="http://schemas.openxmlformats.org/drawingml/2006/picture">
+                  <pic:nvPicPr>
+                    <pic:cNvPr id="1841705744" name=""/>
+                    <pic:cNvPicPr/>
+                  </pic:nvPicPr>
+                  <pic:blipFill rotWithShape="1">
+                    <a:blip r:embed="rId14"/>
+                    <a:srcRect t="5680"/>
+                    <a:stretch>
+                      <a:fillRect/>
+                    </a:stretch>
+                  </pic:blipFill>
+                  <pic:spPr bwMode="auto">
+                    <a:xfrm>
+                      <a:off x="0" y="0"/>
+                      <a:ext cx="5735430" cy="3676225"/>
+                    </a:xfrm>
+                    <a:prstGeom prst="rect">
+                      <a:avLst/>
+                    </a:prstGeom>
+                    <a:ln>
+                      <a:noFill/>
+                    </a:ln>
+                    <a:extLst>
+                      <a:ext uri="{53640926-AAD7-44D8-BBD7-CCE9431645EC}">
+                        <a14:shadowObscured xmlns:a14="http://schemas.microsoft.com/office/drawing/2010/main"/>
+                      </a:ext>
+                    </a:extLst>
+                  </pic:spPr>
+                </pic:pic>
+              </a:graphicData>
+            </a:graphic>
+          </wp:inline>
+        </w:drawing>
+      </w:r>
+    </w:p>
+    <w:p>
+      <w:pPr>
+        <w:spacing w:line="360" w:lineRule="auto"/>
+        <w:rPr>
+          <w:rFonts w:ascii="Times New Roman" w:hAnsi="Times New Roman"/>
+          <w:b/>
+          <w:bCs/>
+          <w:sz w:val="28"/>
+          <w:szCs w:val="28"/>
+        </w:rPr>
+      </w:pPr>
+      <w:r>
+        <w:rPr>
+          <w:noProof/>
+          <w14:ligatures w14:val="standardContextual"/>
+        </w:rPr>
+        <w:lastRenderedPageBreak/>
+        <w:drawing>
+          <wp:inline distT="0" distB="0" distL="0" distR="0" wp14:anchorId="4DA5EC17" wp14:editId="7DA3C0F2">
+            <wp:extent cx="5731510" cy="4991100"/>
+            <wp:effectExtent l="0" t="0" r="2540" b="0"/>
+            <wp:docPr id="1920199043" name="Picture 1"/>
+            <wp:cNvGraphicFramePr>
+              <a:graphicFrameLocks xmlns:a="http://schemas.openxmlformats.org/drawingml/2006/main" noChangeAspect="1"/>
+            </wp:cNvGraphicFramePr>
+            <a:graphic xmlns:a="http://schemas.openxmlformats.org/drawingml/2006/main">
+              <a:graphicData uri="http://schemas.openxmlformats.org/drawingml/2006/picture">
+                <pic:pic xmlns:pic="http://schemas.openxmlformats.org/drawingml/2006/picture">
+                  <pic:nvPicPr>
+                    <pic:cNvPr id="1920199043" name=""/>
+                    <pic:cNvPicPr/>
+                  </pic:nvPicPr>
+                  <pic:blipFill>
+                    <a:blip r:embed="rId15"/>
+                    <a:stretch>
+                      <a:fillRect/>
+                    </a:stretch>
+                  </pic:blipFill>
+                  <pic:spPr>
+                    <a:xfrm>
+                      <a:off x="0" y="0"/>
+                      <a:ext cx="5731510" cy="4991100"/>
+                    </a:xfrm>
+                    <a:prstGeom prst="rect">
+                      <a:avLst/>
+                    </a:prstGeom>
+                  </pic:spPr>
+                </pic:pic>
+              </a:graphicData>
+            </a:graphic>
+          </wp:inline>
+        </w:drawing>
+      </w:r>
+    </w:p>
+    <w:p>
+      <w:pPr>
+        <w:spacing w:line="360" w:lineRule="auto"/>
+        <w:rPr>
+          <w:rFonts w:ascii="Times New Roman" w:hAnsi="Times New Roman"/>
+          <w:b/>
+          <w:bCs/>
+          <w:sz w:val="28"/>
+          <w:szCs w:val="28"/>
+        </w:rPr>
+      </w:pPr>
+      <w:r>
+        <w:rPr>
+          <w:rFonts w:ascii="Times New Roman" w:hAnsi="Times New Roman"/>
+          <w:b/>
+          <w:bCs/>
+          <w:sz w:val="28"/>
+          <w:szCs w:val="28"/>
+        </w:rPr>
+        <w:t>Output:</w:t>
+      </w:r>
+    </w:p>
+    <w:p>
+      <w:pPr>
+        <w:spacing w:line="360" w:lineRule="auto"/>
+        <w:jc w:val="both"/>
+        <w:rPr>
+          <w:rFonts w:ascii="Times New Roman" w:hAnsi="Times New Roman"/>
+          <w:b/>
+          <w:bCs/>
+          <w:sz w:val="28"/>
+          <w:szCs w:val="28"/>
+        </w:rPr>
+      </w:pPr>
+      <w:r>
+        <w:rPr>
+          <w:rFonts w:ascii="Times New Roman" w:hAnsi="Times New Roman"/>
+          <w:b/>
+          <w:bCs/>
+          <w:sz w:val="28"/>
+          <w:szCs w:val="28"/>
+        </w:rPr>
+        <w:t>Task 1</w:t>
+      </w:r>
+    </w:p>
+    <w:p>
+      <w:pPr>
+        <w:spacing w:line="360" w:lineRule="auto"/>
+        <w:jc w:val="both"/>
+        <w:rPr>
+          <w:rFonts w:ascii="Times New Roman" w:hAnsi="Times New Roman"/>
+          <w:sz w:val="28"/>
+          <w:szCs w:val="28"/>
+        </w:rPr>
+      </w:pPr>
+      <w:r>
+        <w:rPr>
+          <w:rFonts w:ascii="Times New Roman" w:hAnsi="Times New Roman"/>
+          <w:sz w:val="28"/>
+          <w:szCs w:val="28"/>
+        </w:rPr>
+        <w:t xml:space="preserve">It </w:t>
+      </w:r>
+      <w:r>
+        <w:rPr>
+          <w:rFonts w:ascii="Times New Roman" w:hAnsi="Times New Roman"/>
+          <w:sz w:val="28"/>
+          <w:szCs w:val="28"/>
+        </w:rPr>
+        <w:t>Loads all 4 documents</w:t>
+      </w:r>
+      <w:r>
+        <w:rPr>
+          <w:rFonts w:ascii="Times New Roman" w:hAnsi="Times New Roman"/>
+          <w:sz w:val="28"/>
+          <w:szCs w:val="28"/>
+        </w:rPr>
+        <w:t xml:space="preserve"> and a</w:t>
+      </w:r>
+      <w:r>
+        <w:rPr>
+          <w:rFonts w:ascii="Times New Roman" w:hAnsi="Times New Roman"/>
+          <w:sz w:val="28"/>
+          <w:szCs w:val="28"/>
+        </w:rPr>
+        <w:t>sks a question that exists in the documents.</w:t>
+      </w:r>
+      <w:r>
+        <w:rPr>
+          <w:rFonts w:ascii="Times New Roman" w:hAnsi="Times New Roman"/>
+          <w:sz w:val="28"/>
+          <w:szCs w:val="28"/>
+        </w:rPr>
+        <w:t xml:space="preserve"> </w:t>
+      </w:r>
+      <w:r>
+        <w:rPr>
+          <w:rFonts w:ascii="Times New Roman" w:hAnsi="Times New Roman"/>
+          <w:sz w:val="28"/>
+          <w:szCs w:val="28"/>
+        </w:rPr>
+        <w:t>Retrieves relevant chunks</w:t>
+      </w:r>
+      <w:r>
+        <w:rPr>
+          <w:rFonts w:ascii="Times New Roman" w:hAnsi="Times New Roman"/>
+          <w:sz w:val="28"/>
+          <w:szCs w:val="28"/>
+        </w:rPr>
+        <w:t xml:space="preserve"> and g</w:t>
+      </w:r>
+      <w:r>
+        <w:rPr>
+          <w:rFonts w:ascii="Times New Roman" w:hAnsi="Times New Roman"/>
+          <w:sz w:val="28"/>
+          <w:szCs w:val="28"/>
+        </w:rPr>
+        <w:t>enerates an answer.</w:t>
+      </w:r>
+    </w:p>
+    <w:p>
+      <w:pPr>
+        <w:spacing w:line="360" w:lineRule="auto"/>
+        <w:jc w:val="both"/>
+        <w:rPr>
+          <w:rFonts w:ascii="Times New Roman" w:hAnsi="Times New Roman"/>
+          <w:b/>
+          <w:bCs/>
+          <w:sz w:val="28"/>
+          <w:szCs w:val="28"/>
+        </w:rPr>
+      </w:pPr>
+      <w:r>
+        <w:rPr>
+          <w:rFonts w:ascii="Times New Roman" w:hAnsi="Times New Roman"/>
+          <w:b/>
+          <w:bCs/>
+          <w:sz w:val="28"/>
+          <w:szCs w:val="28"/>
+        </w:rPr>
+        <w:t>Task 2</w:t>
+      </w:r>
+    </w:p>
+    <w:p>
+      <w:pPr>
+        <w:spacing w:line="360" w:lineRule="auto"/>
+        <w:jc w:val="both"/>
+        <w:rPr>
+          <w:rFonts w:ascii="Times New Roman" w:hAnsi="Times New Roman"/>
+          <w:sz w:val="28"/>
+          <w:szCs w:val="28"/>
+        </w:rPr>
+      </w:pPr>
+      <w:r>
+        <w:rPr>
+          <w:rFonts w:ascii="Times New Roman" w:hAnsi="Times New Roman"/>
+          <w:sz w:val="28"/>
+          <w:szCs w:val="28"/>
+        </w:rPr>
+        <w:t>Asks a question not covered by the documents.</w:t>
+      </w:r>
+      <w:r>
+        <w:rPr>
+          <w:rFonts w:ascii="Times New Roman" w:hAnsi="Times New Roman"/>
+          <w:sz w:val="28"/>
+          <w:szCs w:val="28"/>
+        </w:rPr>
+        <w:t xml:space="preserve"> </w:t>
+      </w:r>
+      <w:r>
+        <w:rPr>
+          <w:rFonts w:ascii="Times New Roman" w:hAnsi="Times New Roman"/>
+          <w:sz w:val="28"/>
+          <w:szCs w:val="28"/>
+        </w:rPr>
+        <w:t>The prompt instructs the model to reply</w:t>
+      </w:r>
+      <w:r>
+        <w:rPr>
+          <w:rFonts w:ascii="Times New Roman" w:hAnsi="Times New Roman"/>
+          <w:sz w:val="28"/>
+          <w:szCs w:val="28"/>
+        </w:rPr>
+        <w:t xml:space="preserve">. </w:t>
+      </w:r>
+      <w:r>
+        <w:rPr>
+          <w:rFonts w:ascii="Times New Roman" w:hAnsi="Times New Roman"/>
+          <w:sz w:val="28"/>
+          <w:szCs w:val="28"/>
+        </w:rPr>
+        <w:t>I don't have that information.</w:t>
+      </w:r>
+    </w:p>
+    <w:p>
+      <w:pPr>
+        <w:spacing w:line="360" w:lineRule="auto"/>
+        <w:jc w:val="both"/>
+        <w:rPr>
+          <w:rFonts w:ascii="Times New Roman" w:hAnsi="Times New Roman"/>
+          <w:b/>
+          <w:bCs/>
+          <w:sz w:val="28"/>
+          <w:szCs w:val="28"/>
+        </w:rPr>
+      </w:pPr>
+      <w:r>
+        <w:rPr>
+          <w:rFonts w:ascii="Times New Roman" w:hAnsi="Times New Roman"/>
+          <w:b/>
+          <w:bCs/>
+          <w:sz w:val="28"/>
+          <w:szCs w:val="28"/>
+        </w:rPr>
+        <w:t>Task 3</w:t>
+      </w:r>
+    </w:p>
+    <w:p>
+      <w:pPr>
+        <w:spacing w:line="360" w:lineRule="auto"/>
+        <w:jc w:val="both"/>
+        <w:rPr>
+          <w:rFonts w:ascii="Times New Roman" w:hAnsi="Times New Roman"/>
+          <w:sz w:val="28"/>
+          <w:szCs w:val="28"/>
+        </w:rPr>
+      </w:pPr>
+      <w:r>
+        <w:rPr>
+          <w:rFonts w:ascii="Times New Roman" w:hAnsi="Times New Roman"/>
+          <w:sz w:val="28"/>
+          <w:szCs w:val="28"/>
+        </w:rPr>
+        <w:t>Prints the metadata (source and chunk) for the retrieved chunks, satisfying the source attribution requirement.</w:t>
+      </w:r>
+    </w:p>
+    <w:p>
+      <w:pPr>
+        <w:spacing w:line="360" w:lineRule="auto"/>
+        <w:rPr>
+          <w:rFonts w:ascii="Times New Roman" w:hAnsi="Times New Roman"/>
+          <w:b/>
+          <w:bCs/>
+          <w:sz w:val="28"/>
+          <w:szCs w:val="28"/>
+        </w:rPr>
+      </w:pPr>
+      <w:r>
+        <w:rPr>
+          <w:noProof/>
+          <w14:ligatures w14:val="standardContextual"/>
+        </w:rPr>
+        <w:lastRenderedPageBreak/>
+        <w:drawing>
+          <wp:inline distT="0" distB="0" distL="0" distR="0" wp14:anchorId="706E9132" wp14:editId="552AD68E">
+            <wp:extent cx="5731510" cy="1871345"/>
+            <wp:effectExtent l="0" t="0" r="2540" b="0"/>
+            <wp:docPr id="1394429990" name="Picture 1"/>
+            <wp:cNvGraphicFramePr>
+              <a:graphicFrameLocks xmlns:a="http://schemas.openxmlformats.org/drawingml/2006/main" noChangeAspect="1"/>
+            </wp:cNvGraphicFramePr>
+            <a:graphic xmlns:a="http://schemas.openxmlformats.org/drawingml/2006/main">
+              <a:graphicData uri="http://schemas.openxmlformats.org/drawingml/2006/picture">
+                <pic:pic xmlns:pic="http://schemas.openxmlformats.org/drawingml/2006/picture">
+                  <pic:nvPicPr>
+                    <pic:cNvPr id="1394429990" name=""/>
+                    <pic:cNvPicPr/>
+                  </pic:nvPicPr>
+                  <pic:blipFill>
+                    <a:blip r:embed="rId16"/>
+                    <a:stretch>
+                      <a:fillRect/>
+                    </a:stretch>
+                  </pic:blipFill>
+                  <pic:spPr>
+                    <a:xfrm>
+                      <a:off x="0" y="0"/>
+                      <a:ext cx="5731510" cy="1871345"/>
+                    </a:xfrm>
+                    <a:prstGeom prst="rect">
+                      <a:avLst/>
+                    </a:prstGeom>
+                  </pic:spPr>
+                </pic:pic>
+              </a:graphicData>
+            </a:graphic>
+          </wp:inline>
+        </w:drawing>
+      </w:r>
+    </w:p>
+    <w:p>
+      <w:pPr>
+        <w:spacing w:line="360" w:lineRule="auto"/>
+        <w:rPr>
+          <w:rFonts w:ascii="Times New Roman" w:hAnsi="Times New Roman"/>
+          <w:b/>
+          <w:bCs/>
+          <w:sz w:val="28"/>
+          <w:szCs w:val="28"/>
+        </w:rPr>
+      </w:pPr>
+      <w:r>
+        <w:rPr>
+          <w:noProof/>
+          <w14:ligatures w14:val="standardContextual"/>
+        </w:rPr>
+        <w:drawing>
+          <wp:inline distT="0" distB="0" distL="0" distR="0" wp14:anchorId="6A8B21D2" wp14:editId="208398BD">
+            <wp:extent cx="5731510" cy="3226435"/>
+            <wp:effectExtent l="0" t="0" r="2540" b="0"/>
+            <wp:docPr id="122105465" name="Picture 1"/>
+            <wp:cNvGraphicFramePr>
+              <a:graphicFrameLocks xmlns:a="http://schemas.openxmlformats.org/drawingml/2006/main" noChangeAspect="1"/>
+            </wp:cNvGraphicFramePr>
+            <a:graphic xmlns:a="http://schemas.openxmlformats.org/drawingml/2006/main">
+              <a:graphicData uri="http://schemas.openxmlformats.org/drawingml/2006/picture">
+                <pic:pic xmlns:pic="http://schemas.openxmlformats.org/drawingml/2006/picture">
+                  <pic:nvPicPr>
+                    <pic:cNvPr id="122105465" name=""/>
+                    <pic:cNvPicPr/>
+                  </pic:nvPicPr>
+                  <pic:blipFill>
+                    <a:blip r:embed="rId17"/>
+                    <a:stretch>
+                      <a:fillRect/>
+                    </a:stretch>
+                  </pic:blipFill>
+                  <pic:spPr>
+                    <a:xfrm>
+                      <a:off x="0" y="0"/>
+                      <a:ext cx="5731510" cy="3226435"/>
+                    </a:xfrm>
+                    <a:prstGeom prst="rect">
+                      <a:avLst/>
+                    </a:prstGeom>
+                  </pic:spPr>
+                </pic:pic>
+              </a:graphicData>
+            </a:graphic>
+          </wp:inline>
+        </w:drawing>
+      </w:r>
+    </w:p>
+    <w:p>
+      <w:pPr>
+        <w:spacing w:line="360" w:lineRule="auto"/>
+        <w:jc w:val="center"/>
+        <w:rPr>
+          <w:rFonts w:ascii="Times New Roman" w:hAnsi="Times New Roman"/>
+          <w:b/>
+          <w:bCs/>
+          <w:sz w:val="32"/>
+          <w:szCs w:val="32"/>
+        </w:rPr>
+      </w:pPr>
+      <w:r>
+        <w:rPr>
+          <w:rFonts w:ascii="Times New Roman" w:hAnsi="Times New Roman"/>
+          <w:b/>
+          <w:bCs/>
+          <w:sz w:val="32"/>
+          <w:szCs w:val="32"/>
+        </w:rPr>
+        <w:t>PART D — RAG QUALITY &amp; HALLUCINATION REDUCTION</w:t>
+      </w:r>
+    </w:p>
+    <w:p>
+      <w:pPr>
+        <w:spacing w:line="360" w:lineRule="auto"/>
+        <w:rPr>
+          <w:rFonts w:ascii="Times New Roman" w:hAnsi="Times New Roman"/>
+          <w:b/>
+          <w:bCs/>
+          <w:sz w:val="28"/>
+          <w:szCs w:val="28"/>
+        </w:rPr>
+      </w:pPr>
+      <w:r>
+        <w:rPr>
+          <w:rFonts w:ascii="Times New Roman" w:hAnsi="Times New Roman"/>
+          <w:b/>
+          <w:bCs/>
+          <w:sz w:val="28"/>
+          <w:szCs w:val="28"/>
+        </w:rPr>
+        <w:t xml:space="preserve">Practice </w:t>
+      </w:r>
+    </w:p>
+    <w:p>
+      <w:pPr>
+        <w:pStyle w:val="ListParagraph"/>
+        <w:numPr>
+          <w:ilvl w:val="0"/>
+          <w:numId w:val="8"/>
+        </w:numPr>
+        <w:spacing w:line="360" w:lineRule="auto"/>
+        <w:rPr>
+          <w:rFonts w:ascii="Times New Roman" w:hAnsi="Times New Roman"/>
+          <w:sz w:val="28"/>
+          <w:szCs w:val="28"/>
+        </w:rPr>
+      </w:pPr>
+      <w:r>
+        <w:rPr>
+          <w:rFonts w:ascii="Times New Roman" w:hAnsi="Times New Roman"/>
+          <w:sz w:val="28"/>
+          <w:szCs w:val="28"/>
+        </w:rPr>
+        <w:t xml:space="preserve">Build a small table of 5 test questions with their expected answers, based on your Part C documents. </w:t>
+      </w:r>
+    </w:p>
+    <w:p>
+      <w:pPr>
+        <w:pStyle w:val="ListParagraph"/>
+        <w:numPr>
+          <w:ilvl w:val="0"/>
+          <w:numId w:val="8"/>
+        </w:numPr>
+        <w:spacing w:line="360" w:lineRule="auto"/>
+        <w:rPr>
+          <w:rFonts w:ascii="Times New Roman" w:hAnsi="Times New Roman"/>
+          <w:sz w:val="28"/>
+          <w:szCs w:val="28"/>
+        </w:rPr>
+      </w:pPr>
+      <w:r>
+        <w:rPr>
+          <w:rFonts w:ascii="Times New Roman" w:hAnsi="Times New Roman"/>
+          <w:sz w:val="28"/>
+          <w:szCs w:val="28"/>
+        </w:rPr>
+        <w:t xml:space="preserve">Run each question through your pipeline and mark, for each one: </w:t>
+      </w:r>
+      <w:proofErr w:type="gramStart"/>
+      <w:r>
+        <w:rPr>
+          <w:rFonts w:ascii="Times New Roman" w:hAnsi="Times New Roman"/>
+          <w:sz w:val="28"/>
+          <w:szCs w:val="28"/>
+        </w:rPr>
+        <w:t>retrieval</w:t>
+      </w:r>
+      <w:proofErr w:type="gramEnd"/>
+      <w:r>
+        <w:rPr>
+          <w:rFonts w:ascii="Times New Roman" w:hAnsi="Times New Roman"/>
+          <w:sz w:val="28"/>
+          <w:szCs w:val="28"/>
+        </w:rPr>
+        <w:t xml:space="preserve"> correct? (yes/no), </w:t>
+      </w:r>
+      <w:proofErr w:type="gramStart"/>
+      <w:r>
+        <w:rPr>
+          <w:rFonts w:ascii="Times New Roman" w:hAnsi="Times New Roman"/>
+          <w:sz w:val="28"/>
+          <w:szCs w:val="28"/>
+        </w:rPr>
+        <w:t>answer</w:t>
+      </w:r>
+      <w:proofErr w:type="gramEnd"/>
+      <w:r>
+        <w:rPr>
+          <w:rFonts w:ascii="Times New Roman" w:hAnsi="Times New Roman"/>
+          <w:sz w:val="28"/>
+          <w:szCs w:val="28"/>
+        </w:rPr>
+        <w:t xml:space="preserve"> correct? (yes/no). </w:t>
+      </w:r>
+    </w:p>
+    <w:p>
+      <w:pPr>
+        <w:pStyle w:val="ListParagraph"/>
+        <w:numPr>
+          <w:ilvl w:val="0"/>
+          <w:numId w:val="8"/>
+        </w:numPr>
+        <w:spacing w:line="360" w:lineRule="auto"/>
+        <w:rPr>
+          <w:rFonts w:ascii="Times New Roman" w:hAnsi="Times New Roman"/>
+          <w:sz w:val="28"/>
+          <w:szCs w:val="28"/>
+        </w:rPr>
+      </w:pPr>
+      <w:r>
+        <w:rPr>
+          <w:rFonts w:ascii="Times New Roman" w:hAnsi="Times New Roman"/>
+          <w:sz w:val="28"/>
+          <w:szCs w:val="28"/>
+        </w:rPr>
+        <w:t xml:space="preserve">For any question that failed, decide whether it was a retrieval failure or a generation failure, and write one sentence explaining why. </w:t>
+      </w:r>
+    </w:p>
+    <w:p>
+      <w:pPr>
+        <w:pStyle w:val="ListParagraph"/>
+        <w:numPr>
+          <w:ilvl w:val="0"/>
+          <w:numId w:val="8"/>
+        </w:numPr>
+        <w:spacing w:line="360" w:lineRule="auto"/>
+        <w:rPr>
+          <w:rFonts w:ascii="Times New Roman" w:hAnsi="Times New Roman"/>
+          <w:sz w:val="28"/>
+          <w:szCs w:val="28"/>
+        </w:rPr>
+      </w:pPr>
+      <w:r>
+        <w:rPr>
+          <w:rFonts w:ascii="Times New Roman" w:hAnsi="Times New Roman"/>
+          <w:sz w:val="28"/>
+          <w:szCs w:val="28"/>
+        </w:rPr>
+        <w:lastRenderedPageBreak/>
+        <w:t>Try halving your chunk size and re-run the same 5 questions — note whether results improved, got worse, or stayed the same.</w:t>
+      </w:r>
+    </w:p>
+    <w:p>
+      <w:pPr>
+        <w:spacing w:line="360" w:lineRule="auto"/>
+        <w:rPr>
+          <w:rFonts w:ascii="Times New Roman" w:hAnsi="Times New Roman"/>
+          <w:b/>
+          <w:bCs/>
+          <w:sz w:val="28"/>
+          <w:szCs w:val="28"/>
+        </w:rPr>
+      </w:pPr>
+      <w:r>
+        <w:rPr>
+          <w:rFonts w:ascii="Times New Roman" w:hAnsi="Times New Roman"/>
+          <w:b/>
+          <w:bCs/>
+          <w:sz w:val="28"/>
+          <w:szCs w:val="28"/>
+        </w:rPr>
+        <w:t>Code:</w:t>
+      </w:r>
+    </w:p>
+    <w:p>
+      <w:pPr>
+        <w:spacing w:line="360" w:lineRule="auto"/>
+        <w:rPr>
+          <w:rFonts w:ascii="Times New Roman" w:hAnsi="Times New Roman"/>
+          <w:b/>
+          <w:bCs/>
+          <w:sz w:val="28"/>
+          <w:szCs w:val="28"/>
+        </w:rPr>
+      </w:pPr>
+    </w:p>
+    <w:p>
+      <w:pPr>
+        <w:spacing w:line="360" w:lineRule="auto"/>
+        <w:rPr>
+          <w:rFonts w:ascii="Times New Roman" w:hAnsi="Times New Roman"/>
+          <w:b/>
+          <w:bCs/>
+          <w:sz w:val="28"/>
+          <w:szCs w:val="28"/>
+        </w:rPr>
+      </w:pPr>
+      <w:r>
+        <w:rPr>
+          <w:rFonts w:ascii="Times New Roman" w:hAnsi="Times New Roman"/>
+          <w:b/>
+          <w:bCs/>
+          <w:sz w:val="28"/>
+          <w:szCs w:val="28"/>
+        </w:rPr>
+        <w:t>Output:</w:t>
+      </w:r>
     </w:p>
     <w:p/>
     <w:p/>
@@ -866,6 +2221,155 @@
 <file path=word/numbering.xml><?xml version="1.0" encoding="utf-8"?>
 <w:numbering xmlns:wpc="http://schemas.microsoft.com/office/word/2010/wordprocessingCanvas" xmlns:cx="http://schemas.microsoft.com/office/drawing/2014/chartex" xmlns:cx1="http://schemas.microsoft.com/office/drawing/2015/9/8/chartex" xmlns:cx2="http://schemas.microsoft.com/office/drawing/2015/10/21/chartex" xmlns:cx3="http://schemas.microsoft.com/office/drawing/2016/5/9/chartex" xmlns:cx4="http://schemas.microsoft.com/office/drawing/2016/5/10/chartex" xmlns:cx5="http://schemas.microsoft.com/office/drawing/2016/5/11/chartex" xmlns:cx6="http://schemas.microsoft.com/office/drawing/2016/5/12/chartex" xmlns:cx7="http://schemas.microsoft.com/office/drawing/2016/5/13/chartex" xmlns:cx8="http://schemas.microsoft.com/office/drawing/2016/5/14/chartex" xmlns:mc="http://schemas.openxmlformats.org/markup-compatibility/2006" xmlns:aink="http://schemas.microsoft.com/office/drawing/2016/ink" xmlns:am3d="http://schemas.microsoft.com/office/drawing/2017/model3d" xmlns:o="urn:schemas-microsoft-com:office:office" xmlns:oel="http://schemas.microsoft.com/office/2019/extlst" xmlns:r="http://schemas.openxmlformats.org/officeDocument/2006/relationships" xmlns:m="http://schemas.openxmlformats.org/officeDocument/2006/math" xmlns:v="urn:schemas-microsoft-com:vml" xmlns:wp14="http://schemas.microsoft.com/office/word/2010/wordprocessingDrawing" xmlns:wp="http://schemas.openxmlformats.org/drawingml/2006/wordprocessingDrawing" xmlns:w10="urn:schemas-microsoft-com:office:word" xmlns:w="http://schemas.openxmlformats.org/wordprocessingml/2006/main" xmlns:w14="http://schemas.microsoft.com/office/word/2010/wordml" xmlns:w15="http://schemas.microsoft.com/office/word/2012/wordml" xmlns:w16cex="http://schemas.microsoft.com/office/word/2018/wordml/cex" xmlns:w16cid="http://schemas.microsoft.com/office/word/2016/wordml/cid" xmlns:w16="http://schemas.microsoft.com/office/word/2018/wordml" xmlns:w16du="http://schemas.microsoft.com/office/word/2023/wordml/word16du" xmlns:w16sdtdh="http://schemas.microsoft.com/office/word/2020/wordml/sdtdatahash" xmlns:w16sdtfl="http://schemas.microsoft.com/office/word/2024/wordml/sdtformatlock" xmlns:w16se="http://schemas.microsoft.com/office/word/2015/wordml/symex" xmlns:wpg="http://schemas.microsoft.com/office/word/2010/wordprocessingGroup" xmlns:wpi="http://schemas.microsoft.com/office/word/2010/wordprocessingInk" xmlns:wne="http://schemas.microsoft.com/office/word/2006/wordml" xmlns:wps="http://schemas.microsoft.com/office/word/2010/wordprocessingShape" mc:Ignorable="w14 w15 w16se w16cid w16 w16cex w16sdtdh w16sdtfl w16du wp14">
   <w:abstractNum w:abstractNumId="0" w15:restartNumberingAfterBreak="0">
+    <w:nsid w:val="00AA3024"/>
+    <w:multiLevelType w:val="multilevel"/>
+    <w:tmpl w:val="0B9260E0"/>
+    <w:lvl w:ilvl="0">
+      <w:start w:val="1"/>
+      <w:numFmt w:val="bullet"/>
+      <w:lvlText w:val=""/>
+      <w:lvlJc w:val="left"/>
+      <w:pPr>
+        <w:tabs>
+          <w:tab w:val="num" w:pos="720"/>
+        </w:tabs>
+        <w:ind w:left="720" w:hanging="360"/>
+      </w:pPr>
+      <w:rPr>
+        <w:rFonts w:ascii="Symbol" w:hAnsi="Symbol" w:hint="default"/>
+        <w:sz w:val="20"/>
+      </w:rPr>
+    </w:lvl>
+    <w:lvl w:ilvl="1" w:tentative="1">
+      <w:start w:val="1"/>
+      <w:numFmt w:val="bullet"/>
+      <w:lvlText w:val=""/>
+      <w:lvlJc w:val="left"/>
+      <w:pPr>
+        <w:tabs>
+          <w:tab w:val="num" w:pos="1440"/>
+        </w:tabs>
+        <w:ind w:left="1440" w:hanging="360"/>
+      </w:pPr>
+      <w:rPr>
+        <w:rFonts w:ascii="Symbol" w:hAnsi="Symbol" w:hint="default"/>
+        <w:sz w:val="20"/>
+      </w:rPr>
+    </w:lvl>
+    <w:lvl w:ilvl="2" w:tentative="1">
+      <w:start w:val="1"/>
+      <w:numFmt w:val="bullet"/>
+      <w:lvlText w:val=""/>
+      <w:lvlJc w:val="left"/>
+      <w:pPr>
+        <w:tabs>
+          <w:tab w:val="num" w:pos="2160"/>
+        </w:tabs>
+        <w:ind w:left="2160" w:hanging="360"/>
+      </w:pPr>
+      <w:rPr>
+        <w:rFonts w:ascii="Symbol" w:hAnsi="Symbol" w:hint="default"/>
+        <w:sz w:val="20"/>
+      </w:rPr>
+    </w:lvl>
+    <w:lvl w:ilvl="3" w:tentative="1">
+      <w:start w:val="1"/>
+      <w:numFmt w:val="bullet"/>
+      <w:lvlText w:val=""/>
+      <w:lvlJc w:val="left"/>
+      <w:pPr>
+        <w:tabs>
+          <w:tab w:val="num" w:pos="2880"/>
+        </w:tabs>
+        <w:ind w:left="2880" w:hanging="360"/>
+      </w:pPr>
+      <w:rPr>
+        <w:rFonts w:ascii="Symbol" w:hAnsi="Symbol" w:hint="default"/>
+        <w:sz w:val="20"/>
+      </w:rPr>
+    </w:lvl>
+    <w:lvl w:ilvl="4" w:tentative="1">
+      <w:start w:val="1"/>
+      <w:numFmt w:val="bullet"/>
+      <w:lvlText w:val=""/>
+      <w:lvlJc w:val="left"/>
+      <w:pPr>
+        <w:tabs>
+          <w:tab w:val="num" w:pos="3600"/>
+        </w:tabs>
+        <w:ind w:left="3600" w:hanging="360"/>
+      </w:pPr>
+      <w:rPr>
+        <w:rFonts w:ascii="Symbol" w:hAnsi="Symbol" w:hint="default"/>
+        <w:sz w:val="20"/>
+      </w:rPr>
+    </w:lvl>
+    <w:lvl w:ilvl="5" w:tentative="1">
+      <w:start w:val="1"/>
+      <w:numFmt w:val="bullet"/>
+      <w:lvlText w:val=""/>
+      <w:lvlJc w:val="left"/>
+      <w:pPr>
+        <w:tabs>
+          <w:tab w:val="num" w:pos="4320"/>
+        </w:tabs>
+        <w:ind w:left="4320" w:hanging="360"/>
+      </w:pPr>
+      <w:rPr>
+        <w:rFonts w:ascii="Symbol" w:hAnsi="Symbol" w:hint="default"/>
+        <w:sz w:val="20"/>
+      </w:rPr>
+    </w:lvl>
+    <w:lvl w:ilvl="6" w:tentative="1">
+      <w:start w:val="1"/>
+      <w:numFmt w:val="bullet"/>
+      <w:lvlText w:val=""/>
+      <w:lvlJc w:val="left"/>
+      <w:pPr>
+        <w:tabs>
+          <w:tab w:val="num" w:pos="5040"/>
+        </w:tabs>
+        <w:ind w:left="5040" w:hanging="360"/>
+      </w:pPr>
+      <w:rPr>
+        <w:rFonts w:ascii="Symbol" w:hAnsi="Symbol" w:hint="default"/>
+        <w:sz w:val="20"/>
+      </w:rPr>
+    </w:lvl>
+    <w:lvl w:ilvl="7" w:tentative="1">
+      <w:start w:val="1"/>
+      <w:numFmt w:val="bullet"/>
+      <w:lvlText w:val=""/>
+      <w:lvlJc w:val="left"/>
+      <w:pPr>
+        <w:tabs>
+          <w:tab w:val="num" w:pos="5760"/>
+        </w:tabs>
+        <w:ind w:left="5760" w:hanging="360"/>
+      </w:pPr>
+      <w:rPr>
+        <w:rFonts w:ascii="Symbol" w:hAnsi="Symbol" w:hint="default"/>
+        <w:sz w:val="20"/>
+      </w:rPr>
+    </w:lvl>
+    <w:lvl w:ilvl="8" w:tentative="1">
+      <w:start w:val="1"/>
+      <w:numFmt w:val="bullet"/>
+      <w:lvlText w:val=""/>
+      <w:lvlJc w:val="left"/>
+      <w:pPr>
+        <w:tabs>
+          <w:tab w:val="num" w:pos="6480"/>
+        </w:tabs>
+        <w:ind w:left="6480" w:hanging="360"/>
+      </w:pPr>
+      <w:rPr>
+        <w:rFonts w:ascii="Symbol" w:hAnsi="Symbol" w:hint="default"/>
+        <w:sz w:val="20"/>
+      </w:rPr>
+    </w:lvl>
+  </w:abstractNum>
+  <w:abstractNum w:abstractNumId="1" w15:restartNumberingAfterBreak="0">
     <w:nsid w:val="092A368D"/>
     <w:multiLevelType w:val="hybridMultilevel"/>
     <w:tmpl w:val="F4C26988"/>
@@ -978,7 +2482,644 @@
       </w:rPr>
     </w:lvl>
   </w:abstractNum>
-  <w:abstractNum w:abstractNumId="1" w15:restartNumberingAfterBreak="0">
+  <w:abstractNum w:abstractNumId="2" w15:restartNumberingAfterBreak="0">
+    <w:nsid w:val="111755E6"/>
+    <w:multiLevelType w:val="hybridMultilevel"/>
+    <w:tmpl w:val="550E4A06"/>
+    <w:lvl w:ilvl="0" w:tplc="08090001">
+      <w:start w:val="1"/>
+      <w:numFmt w:val="bullet"/>
+      <w:lvlText w:val=""/>
+      <w:lvlJc w:val="left"/>
+      <w:pPr>
+        <w:ind w:left="720" w:hanging="360"/>
+      </w:pPr>
+      <w:rPr>
+        <w:rFonts w:ascii="Symbol" w:hAnsi="Symbol" w:hint="default"/>
+      </w:rPr>
+    </w:lvl>
+    <w:lvl w:ilvl="1" w:tplc="08090003" w:tentative="1">
+      <w:start w:val="1"/>
+      <w:numFmt w:val="bullet"/>
+      <w:lvlText w:val="o"/>
+      <w:lvlJc w:val="left"/>
+      <w:pPr>
+        <w:ind w:left="1440" w:hanging="360"/>
+      </w:pPr>
+      <w:rPr>
+        <w:rFonts w:ascii="Courier New" w:hAnsi="Courier New" w:cs="Courier New" w:hint="default"/>
+      </w:rPr>
+    </w:lvl>
+    <w:lvl w:ilvl="2" w:tplc="08090005" w:tentative="1">
+      <w:start w:val="1"/>
+      <w:numFmt w:val="bullet"/>
+      <w:lvlText w:val=""/>
+      <w:lvlJc w:val="left"/>
+      <w:pPr>
+        <w:ind w:left="2160" w:hanging="360"/>
+      </w:pPr>
+      <w:rPr>
+        <w:rFonts w:ascii="Wingdings" w:hAnsi="Wingdings" w:hint="default"/>
+      </w:rPr>
+    </w:lvl>
+    <w:lvl w:ilvl="3" w:tplc="08090001" w:tentative="1">
+      <w:start w:val="1"/>
+      <w:numFmt w:val="bullet"/>
+      <w:lvlText w:val=""/>
+      <w:lvlJc w:val="left"/>
+      <w:pPr>
+        <w:ind w:left="2880" w:hanging="360"/>
+      </w:pPr>
+      <w:rPr>
+        <w:rFonts w:ascii="Symbol" w:hAnsi="Symbol" w:hint="default"/>
+      </w:rPr>
+    </w:lvl>
+    <w:lvl w:ilvl="4" w:tplc="08090003" w:tentative="1">
+      <w:start w:val="1"/>
+      <w:numFmt w:val="bullet"/>
+      <w:lvlText w:val="o"/>
+      <w:lvlJc w:val="left"/>
+      <w:pPr>
+        <w:ind w:left="3600" w:hanging="360"/>
+      </w:pPr>
+      <w:rPr>
+        <w:rFonts w:ascii="Courier New" w:hAnsi="Courier New" w:cs="Courier New" w:hint="default"/>
+      </w:rPr>
+    </w:lvl>
+    <w:lvl w:ilvl="5" w:tplc="08090005" w:tentative="1">
+      <w:start w:val="1"/>
+      <w:numFmt w:val="bullet"/>
+      <w:lvlText w:val=""/>
+      <w:lvlJc w:val="left"/>
+      <w:pPr>
+        <w:ind w:left="4320" w:hanging="360"/>
+      </w:pPr>
+      <w:rPr>
+        <w:rFonts w:ascii="Wingdings" w:hAnsi="Wingdings" w:hint="default"/>
+      </w:rPr>
+    </w:lvl>
+    <w:lvl w:ilvl="6" w:tplc="08090001" w:tentative="1">
+      <w:start w:val="1"/>
+      <w:numFmt w:val="bullet"/>
+      <w:lvlText w:val=""/>
+      <w:lvlJc w:val="left"/>
+      <w:pPr>
+        <w:ind w:left="5040" w:hanging="360"/>
+      </w:pPr>
+      <w:rPr>
+        <w:rFonts w:ascii="Symbol" w:hAnsi="Symbol" w:hint="default"/>
+      </w:rPr>
+    </w:lvl>
+    <w:lvl w:ilvl="7" w:tplc="08090003" w:tentative="1">
+      <w:start w:val="1"/>
+      <w:numFmt w:val="bullet"/>
+      <w:lvlText w:val="o"/>
+      <w:lvlJc w:val="left"/>
+      <w:pPr>
+        <w:ind w:left="5760" w:hanging="360"/>
+      </w:pPr>
+      <w:rPr>
+        <w:rFonts w:ascii="Courier New" w:hAnsi="Courier New" w:cs="Courier New" w:hint="default"/>
+      </w:rPr>
+    </w:lvl>
+    <w:lvl w:ilvl="8" w:tplc="08090005" w:tentative="1">
+      <w:start w:val="1"/>
+      <w:numFmt w:val="bullet"/>
+      <w:lvlText w:val=""/>
+      <w:lvlJc w:val="left"/>
+      <w:pPr>
+        <w:ind w:left="6480" w:hanging="360"/>
+      </w:pPr>
+      <w:rPr>
+        <w:rFonts w:ascii="Wingdings" w:hAnsi="Wingdings" w:hint="default"/>
+      </w:rPr>
+    </w:lvl>
+  </w:abstractNum>
+  <w:abstractNum w:abstractNumId="3" w15:restartNumberingAfterBreak="0">
+    <w:nsid w:val="1B065F9B"/>
+    <w:multiLevelType w:val="multilevel"/>
+    <w:tmpl w:val="28665F9C"/>
+    <w:lvl w:ilvl="0">
+      <w:start w:val="1"/>
+      <w:numFmt w:val="bullet"/>
+      <w:lvlText w:val=""/>
+      <w:lvlJc w:val="left"/>
+      <w:pPr>
+        <w:tabs>
+          <w:tab w:val="num" w:pos="720"/>
+        </w:tabs>
+        <w:ind w:left="720" w:hanging="360"/>
+      </w:pPr>
+      <w:rPr>
+        <w:rFonts w:ascii="Symbol" w:hAnsi="Symbol" w:hint="default"/>
+        <w:sz w:val="20"/>
+      </w:rPr>
+    </w:lvl>
+    <w:lvl w:ilvl="1" w:tentative="1">
+      <w:start w:val="1"/>
+      <w:numFmt w:val="bullet"/>
+      <w:lvlText w:val=""/>
+      <w:lvlJc w:val="left"/>
+      <w:pPr>
+        <w:tabs>
+          <w:tab w:val="num" w:pos="1440"/>
+        </w:tabs>
+        <w:ind w:left="1440" w:hanging="360"/>
+      </w:pPr>
+      <w:rPr>
+        <w:rFonts w:ascii="Symbol" w:hAnsi="Symbol" w:hint="default"/>
+        <w:sz w:val="20"/>
+      </w:rPr>
+    </w:lvl>
+    <w:lvl w:ilvl="2" w:tentative="1">
+      <w:start w:val="1"/>
+      <w:numFmt w:val="bullet"/>
+      <w:lvlText w:val=""/>
+      <w:lvlJc w:val="left"/>
+      <w:pPr>
+        <w:tabs>
+          <w:tab w:val="num" w:pos="2160"/>
+        </w:tabs>
+        <w:ind w:left="2160" w:hanging="360"/>
+      </w:pPr>
+      <w:rPr>
+        <w:rFonts w:ascii="Symbol" w:hAnsi="Symbol" w:hint="default"/>
+        <w:sz w:val="20"/>
+      </w:rPr>
+    </w:lvl>
+    <w:lvl w:ilvl="3" w:tentative="1">
+      <w:start w:val="1"/>
+      <w:numFmt w:val="bullet"/>
+      <w:lvlText w:val=""/>
+      <w:lvlJc w:val="left"/>
+      <w:pPr>
+        <w:tabs>
+          <w:tab w:val="num" w:pos="2880"/>
+        </w:tabs>
+        <w:ind w:left="2880" w:hanging="360"/>
+      </w:pPr>
+      <w:rPr>
+        <w:rFonts w:ascii="Symbol" w:hAnsi="Symbol" w:hint="default"/>
+        <w:sz w:val="20"/>
+      </w:rPr>
+    </w:lvl>
+    <w:lvl w:ilvl="4" w:tentative="1">
+      <w:start w:val="1"/>
+      <w:numFmt w:val="bullet"/>
+      <w:lvlText w:val=""/>
+      <w:lvlJc w:val="left"/>
+      <w:pPr>
+        <w:tabs>
+          <w:tab w:val="num" w:pos="3600"/>
+        </w:tabs>
+        <w:ind w:left="3600" w:hanging="360"/>
+      </w:pPr>
+      <w:rPr>
+        <w:rFonts w:ascii="Symbol" w:hAnsi="Symbol" w:hint="default"/>
+        <w:sz w:val="20"/>
+      </w:rPr>
+    </w:lvl>
+    <w:lvl w:ilvl="5" w:tentative="1">
+      <w:start w:val="1"/>
+      <w:numFmt w:val="bullet"/>
+      <w:lvlText w:val=""/>
+      <w:lvlJc w:val="left"/>
+      <w:pPr>
+        <w:tabs>
+          <w:tab w:val="num" w:pos="4320"/>
+        </w:tabs>
+        <w:ind w:left="4320" w:hanging="360"/>
+      </w:pPr>
+      <w:rPr>
+        <w:rFonts w:ascii="Symbol" w:hAnsi="Symbol" w:hint="default"/>
+        <w:sz w:val="20"/>
+      </w:rPr>
+    </w:lvl>
+    <w:lvl w:ilvl="6" w:tentative="1">
+      <w:start w:val="1"/>
+      <w:numFmt w:val="bullet"/>
+      <w:lvlText w:val=""/>
+      <w:lvlJc w:val="left"/>
+      <w:pPr>
+        <w:tabs>
+          <w:tab w:val="num" w:pos="5040"/>
+        </w:tabs>
+        <w:ind w:left="5040" w:hanging="360"/>
+      </w:pPr>
+      <w:rPr>
+        <w:rFonts w:ascii="Symbol" w:hAnsi="Symbol" w:hint="default"/>
+        <w:sz w:val="20"/>
+      </w:rPr>
+    </w:lvl>
+    <w:lvl w:ilvl="7" w:tentative="1">
+      <w:start w:val="1"/>
+      <w:numFmt w:val="bullet"/>
+      <w:lvlText w:val=""/>
+      <w:lvlJc w:val="left"/>
+      <w:pPr>
+        <w:tabs>
+          <w:tab w:val="num" w:pos="5760"/>
+        </w:tabs>
+        <w:ind w:left="5760" w:hanging="360"/>
+      </w:pPr>
+      <w:rPr>
+        <w:rFonts w:ascii="Symbol" w:hAnsi="Symbol" w:hint="default"/>
+        <w:sz w:val="20"/>
+      </w:rPr>
+    </w:lvl>
+    <w:lvl w:ilvl="8" w:tentative="1">
+      <w:start w:val="1"/>
+      <w:numFmt w:val="bullet"/>
+      <w:lvlText w:val=""/>
+      <w:lvlJc w:val="left"/>
+      <w:pPr>
+        <w:tabs>
+          <w:tab w:val="num" w:pos="6480"/>
+        </w:tabs>
+        <w:ind w:left="6480" w:hanging="360"/>
+      </w:pPr>
+      <w:rPr>
+        <w:rFonts w:ascii="Symbol" w:hAnsi="Symbol" w:hint="default"/>
+        <w:sz w:val="20"/>
+      </w:rPr>
+    </w:lvl>
+  </w:abstractNum>
+  <w:abstractNum w:abstractNumId="4" w15:restartNumberingAfterBreak="0">
+    <w:nsid w:val="2A1B13AB"/>
+    <w:multiLevelType w:val="multilevel"/>
+    <w:tmpl w:val="67AE19CA"/>
+    <w:lvl w:ilvl="0">
+      <w:start w:val="1"/>
+      <w:numFmt w:val="bullet"/>
+      <w:lvlText w:val=""/>
+      <w:lvlJc w:val="left"/>
+      <w:pPr>
+        <w:tabs>
+          <w:tab w:val="num" w:pos="720"/>
+        </w:tabs>
+        <w:ind w:left="720" w:hanging="360"/>
+      </w:pPr>
+      <w:rPr>
+        <w:rFonts w:ascii="Symbol" w:hAnsi="Symbol" w:hint="default"/>
+        <w:sz w:val="20"/>
+      </w:rPr>
+    </w:lvl>
+    <w:lvl w:ilvl="1" w:tentative="1">
+      <w:start w:val="1"/>
+      <w:numFmt w:val="bullet"/>
+      <w:lvlText w:val=""/>
+      <w:lvlJc w:val="left"/>
+      <w:pPr>
+        <w:tabs>
+          <w:tab w:val="num" w:pos="1440"/>
+        </w:tabs>
+        <w:ind w:left="1440" w:hanging="360"/>
+      </w:pPr>
+      <w:rPr>
+        <w:rFonts w:ascii="Symbol" w:hAnsi="Symbol" w:hint="default"/>
+        <w:sz w:val="20"/>
+      </w:rPr>
+    </w:lvl>
+    <w:lvl w:ilvl="2" w:tentative="1">
+      <w:start w:val="1"/>
+      <w:numFmt w:val="bullet"/>
+      <w:lvlText w:val=""/>
+      <w:lvlJc w:val="left"/>
+      <w:pPr>
+        <w:tabs>
+          <w:tab w:val="num" w:pos="2160"/>
+        </w:tabs>
+        <w:ind w:left="2160" w:hanging="360"/>
+      </w:pPr>
+      <w:rPr>
+        <w:rFonts w:ascii="Symbol" w:hAnsi="Symbol" w:hint="default"/>
+        <w:sz w:val="20"/>
+      </w:rPr>
+    </w:lvl>
+    <w:lvl w:ilvl="3" w:tentative="1">
+      <w:start w:val="1"/>
+      <w:numFmt w:val="bullet"/>
+      <w:lvlText w:val=""/>
+      <w:lvlJc w:val="left"/>
+      <w:pPr>
+        <w:tabs>
+          <w:tab w:val="num" w:pos="2880"/>
+        </w:tabs>
+        <w:ind w:left="2880" w:hanging="360"/>
+      </w:pPr>
+      <w:rPr>
+        <w:rFonts w:ascii="Symbol" w:hAnsi="Symbol" w:hint="default"/>
+        <w:sz w:val="20"/>
+      </w:rPr>
+    </w:lvl>
+    <w:lvl w:ilvl="4" w:tentative="1">
+      <w:start w:val="1"/>
+      <w:numFmt w:val="bullet"/>
+      <w:lvlText w:val=""/>
+      <w:lvlJc w:val="left"/>
+      <w:pPr>
+        <w:tabs>
+          <w:tab w:val="num" w:pos="3600"/>
+        </w:tabs>
+        <w:ind w:left="3600" w:hanging="360"/>
+      </w:pPr>
+      <w:rPr>
+        <w:rFonts w:ascii="Symbol" w:hAnsi="Symbol" w:hint="default"/>
+        <w:sz w:val="20"/>
+      </w:rPr>
+    </w:lvl>
+    <w:lvl w:ilvl="5" w:tentative="1">
+      <w:start w:val="1"/>
+      <w:numFmt w:val="bullet"/>
+      <w:lvlText w:val=""/>
+      <w:lvlJc w:val="left"/>
+      <w:pPr>
+        <w:tabs>
+          <w:tab w:val="num" w:pos="4320"/>
+        </w:tabs>
+        <w:ind w:left="4320" w:hanging="360"/>
+      </w:pPr>
+      <w:rPr>
+        <w:rFonts w:ascii="Symbol" w:hAnsi="Symbol" w:hint="default"/>
+        <w:sz w:val="20"/>
+      </w:rPr>
+    </w:lvl>
+    <w:lvl w:ilvl="6" w:tentative="1">
+      <w:start w:val="1"/>
+      <w:numFmt w:val="bullet"/>
+      <w:lvlText w:val=""/>
+      <w:lvlJc w:val="left"/>
+      <w:pPr>
+        <w:tabs>
+          <w:tab w:val="num" w:pos="5040"/>
+        </w:tabs>
+        <w:ind w:left="5040" w:hanging="360"/>
+      </w:pPr>
+      <w:rPr>
+        <w:rFonts w:ascii="Symbol" w:hAnsi="Symbol" w:hint="default"/>
+        <w:sz w:val="20"/>
+      </w:rPr>
+    </w:lvl>
+    <w:lvl w:ilvl="7" w:tentative="1">
+      <w:start w:val="1"/>
+      <w:numFmt w:val="bullet"/>
+      <w:lvlText w:val=""/>
+      <w:lvlJc w:val="left"/>
+      <w:pPr>
+        <w:tabs>
+          <w:tab w:val="num" w:pos="5760"/>
+        </w:tabs>
+        <w:ind w:left="5760" w:hanging="360"/>
+      </w:pPr>
+      <w:rPr>
+        <w:rFonts w:ascii="Symbol" w:hAnsi="Symbol" w:hint="default"/>
+        <w:sz w:val="20"/>
+      </w:rPr>
+    </w:lvl>
+    <w:lvl w:ilvl="8" w:tentative="1">
+      <w:start w:val="1"/>
+      <w:numFmt w:val="bullet"/>
+      <w:lvlText w:val=""/>
+      <w:lvlJc w:val="left"/>
+      <w:pPr>
+        <w:tabs>
+          <w:tab w:val="num" w:pos="6480"/>
+        </w:tabs>
+        <w:ind w:left="6480" w:hanging="360"/>
+      </w:pPr>
+      <w:rPr>
+        <w:rFonts w:ascii="Symbol" w:hAnsi="Symbol" w:hint="default"/>
+        <w:sz w:val="20"/>
+      </w:rPr>
+    </w:lvl>
+  </w:abstractNum>
+  <w:abstractNum w:abstractNumId="5" w15:restartNumberingAfterBreak="0">
+    <w:nsid w:val="52914AE8"/>
+    <w:multiLevelType w:val="hybridMultilevel"/>
+    <w:tmpl w:val="E54C16CC"/>
+    <w:lvl w:ilvl="0" w:tplc="08090001">
+      <w:start w:val="1"/>
+      <w:numFmt w:val="bullet"/>
+      <w:lvlText w:val=""/>
+      <w:lvlJc w:val="left"/>
+      <w:pPr>
+        <w:ind w:left="720" w:hanging="360"/>
+      </w:pPr>
+      <w:rPr>
+        <w:rFonts w:ascii="Symbol" w:hAnsi="Symbol" w:hint="default"/>
+      </w:rPr>
+    </w:lvl>
+    <w:lvl w:ilvl="1" w:tplc="08090003" w:tentative="1">
+      <w:start w:val="1"/>
+      <w:numFmt w:val="bullet"/>
+      <w:lvlText w:val="o"/>
+      <w:lvlJc w:val="left"/>
+      <w:pPr>
+        <w:ind w:left="1440" w:hanging="360"/>
+      </w:pPr>
+      <w:rPr>
+        <w:rFonts w:ascii="Courier New" w:hAnsi="Courier New" w:cs="Courier New" w:hint="default"/>
+      </w:rPr>
+    </w:lvl>
+    <w:lvl w:ilvl="2" w:tplc="08090005" w:tentative="1">
+      <w:start w:val="1"/>
+      <w:numFmt w:val="bullet"/>
+      <w:lvlText w:val=""/>
+      <w:lvlJc w:val="left"/>
+      <w:pPr>
+        <w:ind w:left="2160" w:hanging="360"/>
+      </w:pPr>
+      <w:rPr>
+        <w:rFonts w:ascii="Wingdings" w:hAnsi="Wingdings" w:hint="default"/>
+      </w:rPr>
+    </w:lvl>
+    <w:lvl w:ilvl="3" w:tplc="08090001" w:tentative="1">
+      <w:start w:val="1"/>
+      <w:numFmt w:val="bullet"/>
+      <w:lvlText w:val=""/>
+      <w:lvlJc w:val="left"/>
+      <w:pPr>
+        <w:ind w:left="2880" w:hanging="360"/>
+      </w:pPr>
+      <w:rPr>
+        <w:rFonts w:ascii="Symbol" w:hAnsi="Symbol" w:hint="default"/>
+      </w:rPr>
+    </w:lvl>
+    <w:lvl w:ilvl="4" w:tplc="08090003" w:tentative="1">
+      <w:start w:val="1"/>
+      <w:numFmt w:val="bullet"/>
+      <w:lvlText w:val="o"/>
+      <w:lvlJc w:val="left"/>
+      <w:pPr>
+        <w:ind w:left="3600" w:hanging="360"/>
+      </w:pPr>
+      <w:rPr>
+        <w:rFonts w:ascii="Courier New" w:hAnsi="Courier New" w:cs="Courier New" w:hint="default"/>
+      </w:rPr>
+    </w:lvl>
+    <w:lvl w:ilvl="5" w:tplc="08090005" w:tentative="1">
+      <w:start w:val="1"/>
+      <w:numFmt w:val="bullet"/>
+      <w:lvlText w:val=""/>
+      <w:lvlJc w:val="left"/>
+      <w:pPr>
+        <w:ind w:left="4320" w:hanging="360"/>
+      </w:pPr>
+      <w:rPr>
+        <w:rFonts w:ascii="Wingdings" w:hAnsi="Wingdings" w:hint="default"/>
+      </w:rPr>
+    </w:lvl>
+    <w:lvl w:ilvl="6" w:tplc="08090001" w:tentative="1">
+      <w:start w:val="1"/>
+      <w:numFmt w:val="bullet"/>
+      <w:lvlText w:val=""/>
+      <w:lvlJc w:val="left"/>
+      <w:pPr>
+        <w:ind w:left="5040" w:hanging="360"/>
+      </w:pPr>
+      <w:rPr>
+        <w:rFonts w:ascii="Symbol" w:hAnsi="Symbol" w:hint="default"/>
+      </w:rPr>
+    </w:lvl>
+    <w:lvl w:ilvl="7" w:tplc="08090003" w:tentative="1">
+      <w:start w:val="1"/>
+      <w:numFmt w:val="bullet"/>
+      <w:lvlText w:val="o"/>
+      <w:lvlJc w:val="left"/>
+      <w:pPr>
+        <w:ind w:left="5760" w:hanging="360"/>
+      </w:pPr>
+      <w:rPr>
+        <w:rFonts w:ascii="Courier New" w:hAnsi="Courier New" w:cs="Courier New" w:hint="default"/>
+      </w:rPr>
+    </w:lvl>
+    <w:lvl w:ilvl="8" w:tplc="08090005" w:tentative="1">
+      <w:start w:val="1"/>
+      <w:numFmt w:val="bullet"/>
+      <w:lvlText w:val=""/>
+      <w:lvlJc w:val="left"/>
+      <w:pPr>
+        <w:ind w:left="6480" w:hanging="360"/>
+      </w:pPr>
+      <w:rPr>
+        <w:rFonts w:ascii="Wingdings" w:hAnsi="Wingdings" w:hint="default"/>
+      </w:rPr>
+    </w:lvl>
+  </w:abstractNum>
+  <w:abstractNum w:abstractNumId="6" w15:restartNumberingAfterBreak="0">
+    <w:nsid w:val="53B9253A"/>
+    <w:multiLevelType w:val="hybridMultilevel"/>
+    <w:tmpl w:val="B2249C60"/>
+    <w:lvl w:ilvl="0" w:tplc="08090001">
+      <w:start w:val="1"/>
+      <w:numFmt w:val="bullet"/>
+      <w:lvlText w:val=""/>
+      <w:lvlJc w:val="left"/>
+      <w:pPr>
+        <w:ind w:left="720" w:hanging="360"/>
+      </w:pPr>
+      <w:rPr>
+        <w:rFonts w:ascii="Symbol" w:hAnsi="Symbol" w:hint="default"/>
+      </w:rPr>
+    </w:lvl>
+    <w:lvl w:ilvl="1" w:tplc="08090003" w:tentative="1">
+      <w:start w:val="1"/>
+      <w:numFmt w:val="bullet"/>
+      <w:lvlText w:val="o"/>
+      <w:lvlJc w:val="left"/>
+      <w:pPr>
+        <w:ind w:left="1440" w:hanging="360"/>
+      </w:pPr>
+      <w:rPr>
+        <w:rFonts w:ascii="Courier New" w:hAnsi="Courier New" w:cs="Courier New" w:hint="default"/>
+      </w:rPr>
+    </w:lvl>
+    <w:lvl w:ilvl="2" w:tplc="08090005" w:tentative="1">
+      <w:start w:val="1"/>
+      <w:numFmt w:val="bullet"/>
+      <w:lvlText w:val=""/>
+      <w:lvlJc w:val="left"/>
+      <w:pPr>
+        <w:ind w:left="2160" w:hanging="360"/>
+      </w:pPr>
+      <w:rPr>
+        <w:rFonts w:ascii="Wingdings" w:hAnsi="Wingdings" w:hint="default"/>
+      </w:rPr>
+    </w:lvl>
+    <w:lvl w:ilvl="3" w:tplc="08090001" w:tentative="1">
+      <w:start w:val="1"/>
+      <w:numFmt w:val="bullet"/>
+      <w:lvlText w:val=""/>
+      <w:lvlJc w:val="left"/>
+      <w:pPr>
+        <w:ind w:left="2880" w:hanging="360"/>
+      </w:pPr>
+      <w:rPr>
+        <w:rFonts w:ascii="Symbol" w:hAnsi="Symbol" w:hint="default"/>
+      </w:rPr>
+    </w:lvl>
+    <w:lvl w:ilvl="4" w:tplc="08090003" w:tentative="1">
+      <w:start w:val="1"/>
+      <w:numFmt w:val="bullet"/>
+      <w:lvlText w:val="o"/>
+      <w:lvlJc w:val="left"/>
+      <w:pPr>
+        <w:ind w:left="3600" w:hanging="360"/>
+      </w:pPr>
+      <w:rPr>
+        <w:rFonts w:ascii="Courier New" w:hAnsi="Courier New" w:cs="Courier New" w:hint="default"/>
+      </w:rPr>
+    </w:lvl>
+    <w:lvl w:ilvl="5" w:tplc="08090005" w:tentative="1">
+      <w:start w:val="1"/>
+      <w:numFmt w:val="bullet"/>
+      <w:lvlText w:val=""/>
+      <w:lvlJc w:val="left"/>
+      <w:pPr>
+        <w:ind w:left="4320" w:hanging="360"/>
+      </w:pPr>
+      <w:rPr>
+        <w:rFonts w:ascii="Wingdings" w:hAnsi="Wingdings" w:hint="default"/>
+      </w:rPr>
+    </w:lvl>
+    <w:lvl w:ilvl="6" w:tplc="08090001" w:tentative="1">
+      <w:start w:val="1"/>
+      <w:numFmt w:val="bullet"/>
+      <w:lvlText w:val=""/>
+      <w:lvlJc w:val="left"/>
+      <w:pPr>
+        <w:ind w:left="5040" w:hanging="360"/>
+      </w:pPr>
+      <w:rPr>
+        <w:rFonts w:ascii="Symbol" w:hAnsi="Symbol" w:hint="default"/>
+      </w:rPr>
+    </w:lvl>
+    <w:lvl w:ilvl="7" w:tplc="08090003" w:tentative="1">
+      <w:start w:val="1"/>
+      <w:numFmt w:val="bullet"/>
+      <w:lvlText w:val="o"/>
+      <w:lvlJc w:val="left"/>
+      <w:pPr>
+        <w:ind w:left="5760" w:hanging="360"/>
+      </w:pPr>
+      <w:rPr>
+        <w:rFonts w:ascii="Courier New" w:hAnsi="Courier New" w:cs="Courier New" w:hint="default"/>
+      </w:rPr>
+    </w:lvl>
+    <w:lvl w:ilvl="8" w:tplc="08090005" w:tentative="1">
+      <w:start w:val="1"/>
+      <w:numFmt w:val="bullet"/>
+      <w:lvlText w:val=""/>
+      <w:lvlJc w:val="left"/>
+      <w:pPr>
+        <w:ind w:left="6480" w:hanging="360"/>
+      </w:pPr>
+      <w:rPr>
+        <w:rFonts w:ascii="Wingdings" w:hAnsi="Wingdings" w:hint="default"/>
+      </w:rPr>
+    </w:lvl>
+  </w:abstractNum>
+  <w:abstractNum w:abstractNumId="7" w15:restartNumberingAfterBreak="0">
     <w:nsid w:val="640F6BA6"/>
     <w:multiLevelType w:val="multilevel"/>
     <w:tmpl w:val="22C40E7C"/>
@@ -1128,10 +3269,28 @@
     </w:lvl>
   </w:abstractNum>
   <w:num w:numId="1" w16cid:durableId="573710014">
+    <w:abstractNumId w:val="1"/>
+  </w:num>
+  <w:num w:numId="2" w16cid:durableId="24991271">
+    <w:abstractNumId w:val="7"/>
+  </w:num>
+  <w:num w:numId="3" w16cid:durableId="1786003353">
+    <w:abstractNumId w:val="2"/>
+  </w:num>
+  <w:num w:numId="4" w16cid:durableId="1085958076">
+    <w:abstractNumId w:val="5"/>
+  </w:num>
+  <w:num w:numId="5" w16cid:durableId="99495999">
     <w:abstractNumId w:val="0"/>
   </w:num>
-  <w:num w:numId="2" w16cid:durableId="24991271">
-    <w:abstractNumId w:val="1"/>
+  <w:num w:numId="6" w16cid:durableId="1350836733">
+    <w:abstractNumId w:val="4"/>
+  </w:num>
+  <w:num w:numId="7" w16cid:durableId="522400444">
+    <w:abstractNumId w:val="3"/>
+  </w:num>
+  <w:num w:numId="8" w16cid:durableId="2101556632">
+    <w:abstractNumId w:val="6"/>
   </w:num>
 </w:numbering>
 </file>

</xml_diff>

<commit_message>
feat: add /ask endpoint wiring RAG pipeline into FastAPI service
</commit_message>
<xml_diff>
--- a/AI Software Development Internship.docx
+++ b/AI Software Development Internship.docx
@@ -115,29 +115,7 @@
                                   <w:sz w:val="40"/>
                                   <w:szCs w:val="40"/>
                                 </w:rPr>
-                                <w:t xml:space="preserve">Week </w:t>
-                              </w:r>
-                              <w:r>
-                                <w:rPr>
-                                  <w:rFonts w:ascii="Times New Roman" w:hAnsi="Times New Roman"/>
-                                  <w:b/>
-                                  <w:bCs/>
-                                  <w:color w:val="FFFFFF"/>
-                                  <w:sz w:val="40"/>
-                                  <w:szCs w:val="40"/>
-                                </w:rPr>
-                                <w:t>5</w:t>
-                              </w:r>
-                              <w:r>
-                                <w:rPr>
-                                  <w:rFonts w:ascii="Times New Roman" w:hAnsi="Times New Roman"/>
-                                  <w:b/>
-                                  <w:bCs/>
-                                  <w:color w:val="FFFFFF"/>
-                                  <w:sz w:val="40"/>
-                                  <w:szCs w:val="40"/>
-                                </w:rPr>
-                                <w:t>: Detailed Task Sheet</w:t>
+                                <w:t>Week 5: Detailed Task Sheet</w:t>
                               </w:r>
                             </w:p>
                           </w:txbxContent>
@@ -234,29 +212,7 @@
                             <w:sz w:val="40"/>
                             <w:szCs w:val="40"/>
                           </w:rPr>
-                          <w:t xml:space="preserve">Week </w:t>
-                        </w:r>
-                        <w:r>
-                          <w:rPr>
-                            <w:rFonts w:ascii="Times New Roman" w:hAnsi="Times New Roman"/>
-                            <w:b/>
-                            <w:bCs/>
-                            <w:color w:val="FFFFFF"/>
-                            <w:sz w:val="40"/>
-                            <w:szCs w:val="40"/>
-                          </w:rPr>
-                          <w:t>5</w:t>
-                        </w:r>
-                        <w:r>
-                          <w:rPr>
-                            <w:rFonts w:ascii="Times New Roman" w:hAnsi="Times New Roman"/>
-                            <w:b/>
-                            <w:bCs/>
-                            <w:color w:val="FFFFFF"/>
-                            <w:sz w:val="40"/>
-                            <w:szCs w:val="40"/>
-                          </w:rPr>
-                          <w:t>: Detailed Task Sheet</w:t>
+                          <w:t>Week 5: Detailed Task Sheet</w:t>
                         </w:r>
                       </w:p>
                     </w:txbxContent>
@@ -346,27 +302,7 @@
           <w:sz w:val="32"/>
           <w:szCs w:val="32"/>
         </w:rPr>
-        <w:t xml:space="preserve">Week </w:t>
-      </w:r>
-      <w:r>
-        <w:rPr>
-          <w:rFonts w:ascii="Times New Roman" w:hAnsi="Times New Roman"/>
-          <w:b/>
-          <w:bCs/>
-          <w:sz w:val="32"/>
-          <w:szCs w:val="32"/>
-        </w:rPr>
-        <w:t>5</w:t>
-      </w:r>
-      <w:r>
-        <w:rPr>
-          <w:rFonts w:ascii="Times New Roman" w:hAnsi="Times New Roman"/>
-          <w:b/>
-          <w:bCs/>
-          <w:sz w:val="32"/>
-          <w:szCs w:val="32"/>
-        </w:rPr>
-        <w:t xml:space="preserve"> — Detailed Task Sheet</w:t>
+        <w:t>Week 5 — Detailed Task Sheet</w:t>
       </w:r>
     </w:p>
     <w:p>
@@ -655,12 +591,14 @@
     <w:p>
       <w:pPr>
         <w:rPr>
-          <w:b/>
-          <w:bCs/>
-        </w:rPr>
-      </w:pPr>
-      <w:r>
-        <w:rPr>
+          <w:rFonts w:ascii="Times New Roman" w:hAnsi="Times New Roman"/>
+          <w:b/>
+          <w:bCs/>
+        </w:rPr>
+      </w:pPr>
+      <w:r>
+        <w:rPr>
+          <w:rFonts w:ascii="Times New Roman" w:hAnsi="Times New Roman"/>
           <w:b/>
           <w:bCs/>
         </w:rPr>
@@ -668,19 +606,29 @@
       </w:r>
     </w:p>
     <w:p>
-      <w:r>
+      <w:pPr>
+        <w:rPr>
+          <w:rFonts w:ascii="Times New Roman" w:hAnsi="Times New Roman"/>
+        </w:rPr>
+      </w:pPr>
+      <w:r>
+        <w:rPr>
+          <w:rFonts w:ascii="Times New Roman" w:hAnsi="Times New Roman"/>
+        </w:rPr>
         <w:t>The semantically similar sentences produced a higher cosine similarity score (0.823) than the unrelated sentences (0.536), showing that embeddings capture semantic meaning.</w:t>
       </w:r>
     </w:p>
     <w:p>
       <w:pPr>
         <w:rPr>
-          <w:b/>
-          <w:bCs/>
-        </w:rPr>
-      </w:pPr>
-      <w:r>
-        <w:rPr>
+          <w:rFonts w:ascii="Times New Roman" w:hAnsi="Times New Roman"/>
+          <w:b/>
+          <w:bCs/>
+        </w:rPr>
+      </w:pPr>
+      <w:r>
+        <w:rPr>
+          <w:rFonts w:ascii="Times New Roman" w:hAnsi="Times New Roman"/>
           <w:b/>
           <w:bCs/>
         </w:rPr>
@@ -688,19 +636,29 @@
       </w:r>
     </w:p>
     <w:p>
-      <w:r>
+      <w:pPr>
+        <w:rPr>
+          <w:rFonts w:ascii="Times New Roman" w:hAnsi="Times New Roman"/>
+        </w:rPr>
+      </w:pPr>
+      <w:r>
+        <w:rPr>
+          <w:rFonts w:ascii="Times New Roman" w:hAnsi="Times New Roman"/>
+        </w:rPr>
         <w:t>The embedding consists of 3072 floating-point values. Individually the numbers have no readable meaning; only when compared with another embedding can semantic similarity be measured.</w:t>
       </w:r>
     </w:p>
     <w:p>
       <w:pPr>
         <w:rPr>
-          <w:b/>
-          <w:bCs/>
-        </w:rPr>
-      </w:pPr>
-      <w:r>
-        <w:rPr>
+          <w:rFonts w:ascii="Times New Roman" w:hAnsi="Times New Roman"/>
+          <w:b/>
+          <w:bCs/>
+        </w:rPr>
+      </w:pPr>
+      <w:r>
+        <w:rPr>
+          <w:rFonts w:ascii="Times New Roman" w:hAnsi="Times New Roman"/>
           <w:b/>
           <w:bCs/>
         </w:rPr>
@@ -806,7 +764,6 @@
           <w:sz w:val="32"/>
           <w:szCs w:val="32"/>
         </w:rPr>
-        <w:lastRenderedPageBreak/>
         <w:t>Practice:</w:t>
       </w:r>
     </w:p>
@@ -830,6 +787,7 @@
           <w:sz w:val="28"/>
           <w:szCs w:val="28"/>
         </w:rPr>
+        <w:lastRenderedPageBreak/>
         <w:t xml:space="preserve">Run the script above and confirm the space-related query returns the science fiction book first. </w:t>
       </w:r>
     </w:p>
@@ -1126,13 +1084,7 @@
         <w:rPr>
           <w:rFonts w:ascii="Times New Roman" w:hAnsi="Times New Roman"/>
         </w:rPr>
-        <w:t>T</w:t>
-      </w:r>
-      <w:r>
-        <w:rPr>
-          <w:rFonts w:ascii="Times New Roman" w:hAnsi="Times New Roman"/>
-        </w:rPr>
-        <w:t>ask 2: Metadata Filtering</w:t>
+        <w:t>Task 2: Metadata Filtering</w:t>
       </w:r>
     </w:p>
     <w:p>
@@ -1677,73 +1629,13 @@
         <w:jc w:val="both"/>
         <w:rPr>
           <w:rFonts w:ascii="Times New Roman" w:hAnsi="Times New Roman"/>
-          <w:sz w:val="28"/>
-          <w:szCs w:val="28"/>
-        </w:rPr>
-      </w:pPr>
-      <w:r>
-        <w:rPr>
-          <w:rFonts w:ascii="Times New Roman" w:hAnsi="Times New Roman"/>
-          <w:sz w:val="28"/>
-          <w:szCs w:val="28"/>
-        </w:rPr>
-        <w:t xml:space="preserve">It </w:t>
-      </w:r>
-      <w:r>
-        <w:rPr>
-          <w:rFonts w:ascii="Times New Roman" w:hAnsi="Times New Roman"/>
-          <w:sz w:val="28"/>
-          <w:szCs w:val="28"/>
-        </w:rPr>
-        <w:t>Loads all 4 documents</w:t>
-      </w:r>
-      <w:r>
-        <w:rPr>
-          <w:rFonts w:ascii="Times New Roman" w:hAnsi="Times New Roman"/>
-          <w:sz w:val="28"/>
-          <w:szCs w:val="28"/>
-        </w:rPr>
-        <w:t xml:space="preserve"> and a</w:t>
-      </w:r>
-      <w:r>
-        <w:rPr>
-          <w:rFonts w:ascii="Times New Roman" w:hAnsi="Times New Roman"/>
-          <w:sz w:val="28"/>
-          <w:szCs w:val="28"/>
-        </w:rPr>
-        <w:t>sks a question that exists in the documents.</w:t>
-      </w:r>
-      <w:r>
-        <w:rPr>
-          <w:rFonts w:ascii="Times New Roman" w:hAnsi="Times New Roman"/>
-          <w:sz w:val="28"/>
-          <w:szCs w:val="28"/>
-        </w:rPr>
-        <w:t xml:space="preserve"> </w:t>
-      </w:r>
-      <w:r>
-        <w:rPr>
-          <w:rFonts w:ascii="Times New Roman" w:hAnsi="Times New Roman"/>
-          <w:sz w:val="28"/>
-          <w:szCs w:val="28"/>
-        </w:rPr>
-        <w:t>Retrieves relevant chunks</w:t>
-      </w:r>
-      <w:r>
-        <w:rPr>
-          <w:rFonts w:ascii="Times New Roman" w:hAnsi="Times New Roman"/>
-          <w:sz w:val="28"/>
-          <w:szCs w:val="28"/>
-        </w:rPr>
-        <w:t xml:space="preserve"> and g</w:t>
-      </w:r>
-      <w:r>
-        <w:rPr>
-          <w:rFonts w:ascii="Times New Roman" w:hAnsi="Times New Roman"/>
-          <w:sz w:val="28"/>
-          <w:szCs w:val="28"/>
-        </w:rPr>
-        <w:t>enerates an answer.</w:t>
+        </w:rPr>
+      </w:pPr>
+      <w:r>
+        <w:rPr>
+          <w:rFonts w:ascii="Times New Roman" w:hAnsi="Times New Roman"/>
+        </w:rPr>
+        <w:t>It Loads all 4 documents and asks a question that exists in the documents. Retrieves relevant chunks and generates an answer.</w:t>
       </w:r>
     </w:p>
     <w:p>
@@ -1775,49 +1667,13 @@
         <w:jc w:val="both"/>
         <w:rPr>
           <w:rFonts w:ascii="Times New Roman" w:hAnsi="Times New Roman"/>
-          <w:sz w:val="28"/>
-          <w:szCs w:val="28"/>
-        </w:rPr>
-      </w:pPr>
-      <w:r>
-        <w:rPr>
-          <w:rFonts w:ascii="Times New Roman" w:hAnsi="Times New Roman"/>
-          <w:sz w:val="28"/>
-          <w:szCs w:val="28"/>
-        </w:rPr>
-        <w:t>Asks a question not covered by the documents.</w:t>
-      </w:r>
-      <w:r>
-        <w:rPr>
-          <w:rFonts w:ascii="Times New Roman" w:hAnsi="Times New Roman"/>
-          <w:sz w:val="28"/>
-          <w:szCs w:val="28"/>
-        </w:rPr>
-        <w:t xml:space="preserve"> </w:t>
-      </w:r>
-      <w:r>
-        <w:rPr>
-          <w:rFonts w:ascii="Times New Roman" w:hAnsi="Times New Roman"/>
-          <w:sz w:val="28"/>
-          <w:szCs w:val="28"/>
-        </w:rPr>
-        <w:t>The prompt instructs the model to reply</w:t>
-      </w:r>
-      <w:r>
-        <w:rPr>
-          <w:rFonts w:ascii="Times New Roman" w:hAnsi="Times New Roman"/>
-          <w:sz w:val="28"/>
-          <w:szCs w:val="28"/>
-        </w:rPr>
-        <w:t xml:space="preserve">. </w:t>
-      </w:r>
-      <w:r>
-        <w:rPr>
-          <w:rFonts w:ascii="Times New Roman" w:hAnsi="Times New Roman"/>
-          <w:sz w:val="28"/>
-          <w:szCs w:val="28"/>
-        </w:rPr>
-        <w:t>I don't have that information.</w:t>
+        </w:rPr>
+      </w:pPr>
+      <w:r>
+        <w:rPr>
+          <w:rFonts w:ascii="Times New Roman" w:hAnsi="Times New Roman"/>
+        </w:rPr>
+        <w:t>Asks a question not covered by the documents. The prompt instructs the model to reply. I don't have that information.</w:t>
       </w:r>
     </w:p>
     <w:p>
@@ -1849,15 +1705,11 @@
         <w:jc w:val="both"/>
         <w:rPr>
           <w:rFonts w:ascii="Times New Roman" w:hAnsi="Times New Roman"/>
-          <w:sz w:val="28"/>
-          <w:szCs w:val="28"/>
-        </w:rPr>
-      </w:pPr>
-      <w:r>
-        <w:rPr>
-          <w:rFonts w:ascii="Times New Roman" w:hAnsi="Times New Roman"/>
-          <w:sz w:val="28"/>
-          <w:szCs w:val="28"/>
+        </w:rPr>
+      </w:pPr>
+      <w:r>
+        <w:rPr>
+          <w:rFonts w:ascii="Times New Roman" w:hAnsi="Times New Roman"/>
         </w:rPr>
         <w:t>Prints the metadata (source and chunk) for the retrieved chunks, satisfying the source attribution requirement.</w:t>
       </w:r>
@@ -2176,10 +2028,736 @@
           <w:szCs w:val="28"/>
         </w:rPr>
       </w:pPr>
-    </w:p>
-    <w:p>
-      <w:pPr>
-        <w:spacing w:line="360" w:lineRule="auto"/>
+      <w:r>
+        <w:rPr>
+          <w:noProof/>
+          <w14:ligatures w14:val="standardContextual"/>
+        </w:rPr>
+        <w:drawing>
+          <wp:inline distT="0" distB="0" distL="0" distR="0" wp14:anchorId="4F72DF5D" wp14:editId="05DEA53B">
+            <wp:extent cx="5731510" cy="3583940"/>
+            <wp:effectExtent l="0" t="0" r="2540" b="0"/>
+            <wp:docPr id="167342594" name="Picture 1"/>
+            <wp:cNvGraphicFramePr>
+              <a:graphicFrameLocks xmlns:a="http://schemas.openxmlformats.org/drawingml/2006/main" noChangeAspect="1"/>
+            </wp:cNvGraphicFramePr>
+            <a:graphic xmlns:a="http://schemas.openxmlformats.org/drawingml/2006/main">
+              <a:graphicData uri="http://schemas.openxmlformats.org/drawingml/2006/picture">
+                <pic:pic xmlns:pic="http://schemas.openxmlformats.org/drawingml/2006/picture">
+                  <pic:nvPicPr>
+                    <pic:cNvPr id="167342594" name=""/>
+                    <pic:cNvPicPr/>
+                  </pic:nvPicPr>
+                  <pic:blipFill>
+                    <a:blip r:embed="rId18"/>
+                    <a:stretch>
+                      <a:fillRect/>
+                    </a:stretch>
+                  </pic:blipFill>
+                  <pic:spPr>
+                    <a:xfrm>
+                      <a:off x="0" y="0"/>
+                      <a:ext cx="5731510" cy="3583940"/>
+                    </a:xfrm>
+                    <a:prstGeom prst="rect">
+                      <a:avLst/>
+                    </a:prstGeom>
+                  </pic:spPr>
+                </pic:pic>
+              </a:graphicData>
+            </a:graphic>
+          </wp:inline>
+        </w:drawing>
+      </w:r>
+    </w:p>
+    <w:p>
+      <w:pPr>
+        <w:spacing w:line="360" w:lineRule="auto"/>
+        <w:rPr>
+          <w:rFonts w:ascii="Times New Roman" w:hAnsi="Times New Roman"/>
+          <w:b/>
+          <w:bCs/>
+          <w:sz w:val="28"/>
+          <w:szCs w:val="28"/>
+        </w:rPr>
+      </w:pPr>
+      <w:r>
+        <w:rPr>
+          <w:noProof/>
+          <w14:ligatures w14:val="standardContextual"/>
+        </w:rPr>
+        <w:drawing>
+          <wp:inline distT="0" distB="0" distL="0" distR="0" wp14:anchorId="21CB8CA3" wp14:editId="738F1FE5">
+            <wp:extent cx="5731510" cy="1863090"/>
+            <wp:effectExtent l="0" t="0" r="2540" b="3810"/>
+            <wp:docPr id="2132828901" name="Picture 1"/>
+            <wp:cNvGraphicFramePr>
+              <a:graphicFrameLocks xmlns:a="http://schemas.openxmlformats.org/drawingml/2006/main" noChangeAspect="1"/>
+            </wp:cNvGraphicFramePr>
+            <a:graphic xmlns:a="http://schemas.openxmlformats.org/drawingml/2006/main">
+              <a:graphicData uri="http://schemas.openxmlformats.org/drawingml/2006/picture">
+                <pic:pic xmlns:pic="http://schemas.openxmlformats.org/drawingml/2006/picture">
+                  <pic:nvPicPr>
+                    <pic:cNvPr id="2132828901" name=""/>
+                    <pic:cNvPicPr/>
+                  </pic:nvPicPr>
+                  <pic:blipFill>
+                    <a:blip r:embed="rId19"/>
+                    <a:stretch>
+                      <a:fillRect/>
+                    </a:stretch>
+                  </pic:blipFill>
+                  <pic:spPr>
+                    <a:xfrm>
+                      <a:off x="0" y="0"/>
+                      <a:ext cx="5731510" cy="1863090"/>
+                    </a:xfrm>
+                    <a:prstGeom prst="rect">
+                      <a:avLst/>
+                    </a:prstGeom>
+                  </pic:spPr>
+                </pic:pic>
+              </a:graphicData>
+            </a:graphic>
+          </wp:inline>
+        </w:drawing>
+      </w:r>
+    </w:p>
+    <w:p>
+      <w:pPr>
+        <w:spacing w:line="360" w:lineRule="auto"/>
+        <w:rPr>
+          <w:rFonts w:ascii="Times New Roman" w:hAnsi="Times New Roman"/>
+          <w:b/>
+          <w:bCs/>
+          <w:sz w:val="28"/>
+          <w:szCs w:val="28"/>
+        </w:rPr>
+      </w:pPr>
+      <w:r>
+        <w:rPr>
+          <w:noProof/>
+          <w14:ligatures w14:val="standardContextual"/>
+        </w:rPr>
+        <w:lastRenderedPageBreak/>
+        <w:drawing>
+          <wp:inline distT="0" distB="0" distL="0" distR="0" wp14:anchorId="03901C9D" wp14:editId="701EC6F8">
+            <wp:extent cx="5731510" cy="4120515"/>
+            <wp:effectExtent l="0" t="0" r="2540" b="0"/>
+            <wp:docPr id="1218303106" name="Picture 1"/>
+            <wp:cNvGraphicFramePr>
+              <a:graphicFrameLocks xmlns:a="http://schemas.openxmlformats.org/drawingml/2006/main" noChangeAspect="1"/>
+            </wp:cNvGraphicFramePr>
+            <a:graphic xmlns:a="http://schemas.openxmlformats.org/drawingml/2006/main">
+              <a:graphicData uri="http://schemas.openxmlformats.org/drawingml/2006/picture">
+                <pic:pic xmlns:pic="http://schemas.openxmlformats.org/drawingml/2006/picture">
+                  <pic:nvPicPr>
+                    <pic:cNvPr id="1218303106" name=""/>
+                    <pic:cNvPicPr/>
+                  </pic:nvPicPr>
+                  <pic:blipFill>
+                    <a:blip r:embed="rId20"/>
+                    <a:stretch>
+                      <a:fillRect/>
+                    </a:stretch>
+                  </pic:blipFill>
+                  <pic:spPr>
+                    <a:xfrm>
+                      <a:off x="0" y="0"/>
+                      <a:ext cx="5731510" cy="4120515"/>
+                    </a:xfrm>
+                    <a:prstGeom prst="rect">
+                      <a:avLst/>
+                    </a:prstGeom>
+                  </pic:spPr>
+                </pic:pic>
+              </a:graphicData>
+            </a:graphic>
+          </wp:inline>
+        </w:drawing>
+      </w:r>
+    </w:p>
+    <w:p>
+      <w:pPr>
+        <w:spacing w:line="360" w:lineRule="auto"/>
+        <w:rPr>
+          <w:rFonts w:ascii="Times New Roman" w:hAnsi="Times New Roman"/>
+          <w:b/>
+          <w:bCs/>
+          <w:sz w:val="28"/>
+          <w:szCs w:val="28"/>
+        </w:rPr>
+      </w:pPr>
+      <w:r>
+        <w:rPr>
+          <w:noProof/>
+          <w14:ligatures w14:val="standardContextual"/>
+        </w:rPr>
+        <w:drawing>
+          <wp:inline distT="0" distB="0" distL="0" distR="0" wp14:anchorId="29A2B061" wp14:editId="7FE05D99">
+            <wp:extent cx="5731510" cy="1479550"/>
+            <wp:effectExtent l="0" t="0" r="2540" b="6350"/>
+            <wp:docPr id="770591742" name="Picture 1"/>
+            <wp:cNvGraphicFramePr>
+              <a:graphicFrameLocks xmlns:a="http://schemas.openxmlformats.org/drawingml/2006/main" noChangeAspect="1"/>
+            </wp:cNvGraphicFramePr>
+            <a:graphic xmlns:a="http://schemas.openxmlformats.org/drawingml/2006/main">
+              <a:graphicData uri="http://schemas.openxmlformats.org/drawingml/2006/picture">
+                <pic:pic xmlns:pic="http://schemas.openxmlformats.org/drawingml/2006/picture">
+                  <pic:nvPicPr>
+                    <pic:cNvPr id="770591742" name=""/>
+                    <pic:cNvPicPr/>
+                  </pic:nvPicPr>
+                  <pic:blipFill>
+                    <a:blip r:embed="rId21"/>
+                    <a:stretch>
+                      <a:fillRect/>
+                    </a:stretch>
+                  </pic:blipFill>
+                  <pic:spPr>
+                    <a:xfrm>
+                      <a:off x="0" y="0"/>
+                      <a:ext cx="5731510" cy="1479550"/>
+                    </a:xfrm>
+                    <a:prstGeom prst="rect">
+                      <a:avLst/>
+                    </a:prstGeom>
+                  </pic:spPr>
+                </pic:pic>
+              </a:graphicData>
+            </a:graphic>
+          </wp:inline>
+        </w:drawing>
+      </w:r>
+    </w:p>
+    <w:p>
+      <w:pPr>
+        <w:spacing w:line="360" w:lineRule="auto"/>
+        <w:rPr>
+          <w:rFonts w:ascii="Times New Roman" w:hAnsi="Times New Roman"/>
+          <w:b/>
+          <w:bCs/>
+          <w:sz w:val="28"/>
+          <w:szCs w:val="28"/>
+        </w:rPr>
+      </w:pPr>
+      <w:r>
+        <w:rPr>
+          <w:rFonts w:ascii="Times New Roman" w:hAnsi="Times New Roman"/>
+          <w:b/>
+          <w:bCs/>
+          <w:sz w:val="28"/>
+          <w:szCs w:val="28"/>
+        </w:rPr>
+        <w:t>Output:</w:t>
+      </w:r>
+    </w:p>
+    <w:p>
+      <w:pPr>
+        <w:spacing w:line="360" w:lineRule="auto"/>
+        <w:rPr>
+          <w:rFonts w:ascii="Times New Roman" w:hAnsi="Times New Roman"/>
+          <w:b/>
+          <w:bCs/>
+          <w:sz w:val="28"/>
+          <w:szCs w:val="28"/>
+        </w:rPr>
+      </w:pPr>
+      <w:r>
+        <w:rPr>
+          <w:noProof/>
+          <w14:ligatures w14:val="standardContextual"/>
+        </w:rPr>
+        <w:drawing>
+          <wp:inline distT="0" distB="0" distL="0" distR="0" wp14:anchorId="1B0B025E" wp14:editId="25EF110E">
+            <wp:extent cx="5731510" cy="2128520"/>
+            <wp:effectExtent l="0" t="0" r="2540" b="5080"/>
+            <wp:docPr id="2008571938" name="Picture 1"/>
+            <wp:cNvGraphicFramePr>
+              <a:graphicFrameLocks xmlns:a="http://schemas.openxmlformats.org/drawingml/2006/main" noChangeAspect="1"/>
+            </wp:cNvGraphicFramePr>
+            <a:graphic xmlns:a="http://schemas.openxmlformats.org/drawingml/2006/main">
+              <a:graphicData uri="http://schemas.openxmlformats.org/drawingml/2006/picture">
+                <pic:pic xmlns:pic="http://schemas.openxmlformats.org/drawingml/2006/picture">
+                  <pic:nvPicPr>
+                    <pic:cNvPr id="2008571938" name=""/>
+                    <pic:cNvPicPr/>
+                  </pic:nvPicPr>
+                  <pic:blipFill>
+                    <a:blip r:embed="rId22"/>
+                    <a:stretch>
+                      <a:fillRect/>
+                    </a:stretch>
+                  </pic:blipFill>
+                  <pic:spPr>
+                    <a:xfrm>
+                      <a:off x="0" y="0"/>
+                      <a:ext cx="5731510" cy="2128520"/>
+                    </a:xfrm>
+                    <a:prstGeom prst="rect">
+                      <a:avLst/>
+                    </a:prstGeom>
+                  </pic:spPr>
+                </pic:pic>
+              </a:graphicData>
+            </a:graphic>
+          </wp:inline>
+        </w:drawing>
+      </w:r>
+    </w:p>
+    <w:p>
+      <w:pPr>
+        <w:spacing w:line="360" w:lineRule="auto"/>
+        <w:rPr>
+          <w:rFonts w:ascii="Times New Roman" w:hAnsi="Times New Roman"/>
+          <w:b/>
+          <w:bCs/>
+          <w:sz w:val="28"/>
+          <w:szCs w:val="28"/>
+        </w:rPr>
+      </w:pPr>
+      <w:r>
+        <w:rPr>
+          <w:noProof/>
+          <w14:ligatures w14:val="standardContextual"/>
+        </w:rPr>
+        <w:lastRenderedPageBreak/>
+        <w:drawing>
+          <wp:inline distT="0" distB="0" distL="0" distR="0" wp14:anchorId="3F35DA2D" wp14:editId="52C801B3">
+            <wp:extent cx="5731510" cy="2100580"/>
+            <wp:effectExtent l="0" t="0" r="2540" b="0"/>
+            <wp:docPr id="108796244" name="Picture 1"/>
+            <wp:cNvGraphicFramePr>
+              <a:graphicFrameLocks xmlns:a="http://schemas.openxmlformats.org/drawingml/2006/main" noChangeAspect="1"/>
+            </wp:cNvGraphicFramePr>
+            <a:graphic xmlns:a="http://schemas.openxmlformats.org/drawingml/2006/main">
+              <a:graphicData uri="http://schemas.openxmlformats.org/drawingml/2006/picture">
+                <pic:pic xmlns:pic="http://schemas.openxmlformats.org/drawingml/2006/picture">
+                  <pic:nvPicPr>
+                    <pic:cNvPr id="108796244" name=""/>
+                    <pic:cNvPicPr/>
+                  </pic:nvPicPr>
+                  <pic:blipFill>
+                    <a:blip r:embed="rId23"/>
+                    <a:stretch>
+                      <a:fillRect/>
+                    </a:stretch>
+                  </pic:blipFill>
+                  <pic:spPr>
+                    <a:xfrm>
+                      <a:off x="0" y="0"/>
+                      <a:ext cx="5731510" cy="2100580"/>
+                    </a:xfrm>
+                    <a:prstGeom prst="rect">
+                      <a:avLst/>
+                    </a:prstGeom>
+                  </pic:spPr>
+                </pic:pic>
+              </a:graphicData>
+            </a:graphic>
+          </wp:inline>
+        </w:drawing>
+      </w:r>
+    </w:p>
+    <w:p>
+      <w:pPr>
+        <w:spacing w:line="360" w:lineRule="auto"/>
+        <w:rPr>
+          <w:rFonts w:ascii="Times New Roman" w:hAnsi="Times New Roman"/>
+          <w:b/>
+          <w:bCs/>
+          <w:sz w:val="28"/>
+          <w:szCs w:val="28"/>
+        </w:rPr>
+      </w:pPr>
+      <w:r>
+        <w:rPr>
+          <w:noProof/>
+          <w14:ligatures w14:val="standardContextual"/>
+        </w:rPr>
+        <w:drawing>
+          <wp:inline distT="0" distB="0" distL="0" distR="0" wp14:anchorId="566009C3" wp14:editId="4A2D1D97">
+            <wp:extent cx="5731510" cy="2160270"/>
+            <wp:effectExtent l="0" t="0" r="2540" b="0"/>
+            <wp:docPr id="1560806147" name="Picture 1"/>
+            <wp:cNvGraphicFramePr>
+              <a:graphicFrameLocks xmlns:a="http://schemas.openxmlformats.org/drawingml/2006/main" noChangeAspect="1"/>
+            </wp:cNvGraphicFramePr>
+            <a:graphic xmlns:a="http://schemas.openxmlformats.org/drawingml/2006/main">
+              <a:graphicData uri="http://schemas.openxmlformats.org/drawingml/2006/picture">
+                <pic:pic xmlns:pic="http://schemas.openxmlformats.org/drawingml/2006/picture">
+                  <pic:nvPicPr>
+                    <pic:cNvPr id="1560806147" name=""/>
+                    <pic:cNvPicPr/>
+                  </pic:nvPicPr>
+                  <pic:blipFill>
+                    <a:blip r:embed="rId24"/>
+                    <a:stretch>
+                      <a:fillRect/>
+                    </a:stretch>
+                  </pic:blipFill>
+                  <pic:spPr>
+                    <a:xfrm>
+                      <a:off x="0" y="0"/>
+                      <a:ext cx="5731510" cy="2160270"/>
+                    </a:xfrm>
+                    <a:prstGeom prst="rect">
+                      <a:avLst/>
+                    </a:prstGeom>
+                  </pic:spPr>
+                </pic:pic>
+              </a:graphicData>
+            </a:graphic>
+          </wp:inline>
+        </w:drawing>
+      </w:r>
+    </w:p>
+    <w:p>
+      <w:pPr>
+        <w:spacing w:line="360" w:lineRule="auto"/>
+        <w:rPr>
+          <w:rFonts w:ascii="Times New Roman" w:hAnsi="Times New Roman"/>
+          <w:b/>
+          <w:bCs/>
+          <w:sz w:val="28"/>
+          <w:szCs w:val="28"/>
+        </w:rPr>
+      </w:pPr>
+      <w:r>
+        <w:rPr>
+          <w:noProof/>
+          <w14:ligatures w14:val="standardContextual"/>
+        </w:rPr>
+        <w:drawing>
+          <wp:inline distT="0" distB="0" distL="0" distR="0" wp14:anchorId="5A8A68D6" wp14:editId="1BD5DA5B">
+            <wp:extent cx="5731510" cy="2271395"/>
+            <wp:effectExtent l="0" t="0" r="2540" b="0"/>
+            <wp:docPr id="1906363216" name="Picture 1"/>
+            <wp:cNvGraphicFramePr>
+              <a:graphicFrameLocks xmlns:a="http://schemas.openxmlformats.org/drawingml/2006/main" noChangeAspect="1"/>
+            </wp:cNvGraphicFramePr>
+            <a:graphic xmlns:a="http://schemas.openxmlformats.org/drawingml/2006/main">
+              <a:graphicData uri="http://schemas.openxmlformats.org/drawingml/2006/picture">
+                <pic:pic xmlns:pic="http://schemas.openxmlformats.org/drawingml/2006/picture">
+                  <pic:nvPicPr>
+                    <pic:cNvPr id="1906363216" name=""/>
+                    <pic:cNvPicPr/>
+                  </pic:nvPicPr>
+                  <pic:blipFill>
+                    <a:blip r:embed="rId25"/>
+                    <a:stretch>
+                      <a:fillRect/>
+                    </a:stretch>
+                  </pic:blipFill>
+                  <pic:spPr>
+                    <a:xfrm>
+                      <a:off x="0" y="0"/>
+                      <a:ext cx="5731510" cy="2271395"/>
+                    </a:xfrm>
+                    <a:prstGeom prst="rect">
+                      <a:avLst/>
+                    </a:prstGeom>
+                  </pic:spPr>
+                </pic:pic>
+              </a:graphicData>
+            </a:graphic>
+          </wp:inline>
+        </w:drawing>
+      </w:r>
+    </w:p>
+    <w:p>
+      <w:pPr>
+        <w:spacing w:line="360" w:lineRule="auto"/>
+        <w:rPr>
+          <w:rFonts w:ascii="Times New Roman" w:hAnsi="Times New Roman"/>
+          <w:b/>
+          <w:bCs/>
+          <w:sz w:val="28"/>
+          <w:szCs w:val="28"/>
+        </w:rPr>
+      </w:pPr>
+      <w:r>
+        <w:rPr>
+          <w:noProof/>
+          <w14:ligatures w14:val="standardContextual"/>
+        </w:rPr>
+        <w:lastRenderedPageBreak/>
+        <w:drawing>
+          <wp:inline distT="0" distB="0" distL="0" distR="0" wp14:anchorId="2F2E8C04" wp14:editId="31034F04">
+            <wp:extent cx="5731510" cy="2393950"/>
+            <wp:effectExtent l="0" t="0" r="2540" b="6350"/>
+            <wp:docPr id="378706009" name="Picture 1"/>
+            <wp:cNvGraphicFramePr>
+              <a:graphicFrameLocks xmlns:a="http://schemas.openxmlformats.org/drawingml/2006/main" noChangeAspect="1"/>
+            </wp:cNvGraphicFramePr>
+            <a:graphic xmlns:a="http://schemas.openxmlformats.org/drawingml/2006/main">
+              <a:graphicData uri="http://schemas.openxmlformats.org/drawingml/2006/picture">
+                <pic:pic xmlns:pic="http://schemas.openxmlformats.org/drawingml/2006/picture">
+                  <pic:nvPicPr>
+                    <pic:cNvPr id="378706009" name=""/>
+                    <pic:cNvPicPr/>
+                  </pic:nvPicPr>
+                  <pic:blipFill>
+                    <a:blip r:embed="rId26"/>
+                    <a:stretch>
+                      <a:fillRect/>
+                    </a:stretch>
+                  </pic:blipFill>
+                  <pic:spPr>
+                    <a:xfrm>
+                      <a:off x="0" y="0"/>
+                      <a:ext cx="5731510" cy="2393950"/>
+                    </a:xfrm>
+                    <a:prstGeom prst="rect">
+                      <a:avLst/>
+                    </a:prstGeom>
+                  </pic:spPr>
+                </pic:pic>
+              </a:graphicData>
+            </a:graphic>
+          </wp:inline>
+        </w:drawing>
+      </w:r>
+    </w:p>
+    <w:p>
+      <w:pPr>
+        <w:spacing w:line="360" w:lineRule="auto"/>
+        <w:rPr>
+          <w:rFonts w:ascii="Times New Roman" w:hAnsi="Times New Roman"/>
+          <w:b/>
+          <w:bCs/>
+          <w:sz w:val="28"/>
+          <w:szCs w:val="28"/>
+        </w:rPr>
+      </w:pPr>
+      <w:r>
+        <w:rPr>
+          <w:noProof/>
+          <w14:ligatures w14:val="standardContextual"/>
+        </w:rPr>
+        <w:drawing>
+          <wp:inline distT="0" distB="0" distL="0" distR="0" wp14:anchorId="555C4DB6" wp14:editId="6FD6F2F3">
+            <wp:extent cx="5731510" cy="1300480"/>
+            <wp:effectExtent l="0" t="0" r="2540" b="0"/>
+            <wp:docPr id="493840631" name="Picture 1"/>
+            <wp:cNvGraphicFramePr>
+              <a:graphicFrameLocks xmlns:a="http://schemas.openxmlformats.org/drawingml/2006/main" noChangeAspect="1"/>
+            </wp:cNvGraphicFramePr>
+            <a:graphic xmlns:a="http://schemas.openxmlformats.org/drawingml/2006/main">
+              <a:graphicData uri="http://schemas.openxmlformats.org/drawingml/2006/picture">
+                <pic:pic xmlns:pic="http://schemas.openxmlformats.org/drawingml/2006/picture">
+                  <pic:nvPicPr>
+                    <pic:cNvPr id="493840631" name=""/>
+                    <pic:cNvPicPr/>
+                  </pic:nvPicPr>
+                  <pic:blipFill>
+                    <a:blip r:embed="rId27"/>
+                    <a:stretch>
+                      <a:fillRect/>
+                    </a:stretch>
+                  </pic:blipFill>
+                  <pic:spPr>
+                    <a:xfrm>
+                      <a:off x="0" y="0"/>
+                      <a:ext cx="5731510" cy="1300480"/>
+                    </a:xfrm>
+                    <a:prstGeom prst="rect">
+                      <a:avLst/>
+                    </a:prstGeom>
+                  </pic:spPr>
+                </pic:pic>
+              </a:graphicData>
+            </a:graphic>
+          </wp:inline>
+        </w:drawing>
+      </w:r>
+    </w:p>
+    <w:p>
+      <w:pPr>
+        <w:spacing w:line="360" w:lineRule="auto"/>
+        <w:rPr>
+          <w:rFonts w:ascii="Times New Roman" w:hAnsi="Times New Roman"/>
+          <w:b/>
+          <w:bCs/>
+          <w:sz w:val="28"/>
+          <w:szCs w:val="28"/>
+        </w:rPr>
+      </w:pPr>
+    </w:p>
+    <w:p>
+      <w:pPr>
+        <w:spacing w:line="360" w:lineRule="auto"/>
+        <w:jc w:val="center"/>
+        <w:rPr>
+          <w:rFonts w:ascii="Times New Roman" w:hAnsi="Times New Roman"/>
+          <w:b/>
+          <w:bCs/>
+          <w:sz w:val="32"/>
+          <w:szCs w:val="32"/>
+        </w:rPr>
+      </w:pPr>
+      <w:r>
+        <w:rPr>
+          <w:rFonts w:ascii="Times New Roman" w:hAnsi="Times New Roman"/>
+          <w:b/>
+          <w:bCs/>
+          <w:sz w:val="32"/>
+          <w:szCs w:val="32"/>
+        </w:rPr>
+        <w:t>PART E — ADDING A /ask ENDPOINT TO THE FASTAPI SERVIC</w:t>
+      </w:r>
+      <w:r>
+        <w:rPr>
+          <w:rFonts w:ascii="Times New Roman" w:hAnsi="Times New Roman"/>
+          <w:b/>
+          <w:bCs/>
+          <w:sz w:val="32"/>
+          <w:szCs w:val="32"/>
+        </w:rPr>
+        <w:t>E</w:t>
+      </w:r>
+    </w:p>
+    <w:p>
+      <w:pPr>
+        <w:spacing w:line="360" w:lineRule="auto"/>
+        <w:rPr>
+          <w:rFonts w:ascii="Times New Roman" w:hAnsi="Times New Roman"/>
+          <w:b/>
+          <w:bCs/>
+          <w:sz w:val="28"/>
+          <w:szCs w:val="28"/>
+        </w:rPr>
+      </w:pPr>
+      <w:r>
+        <w:rPr>
+          <w:rFonts w:ascii="Times New Roman" w:hAnsi="Times New Roman"/>
+          <w:b/>
+          <w:bCs/>
+          <w:sz w:val="28"/>
+          <w:szCs w:val="28"/>
+        </w:rPr>
+        <w:t xml:space="preserve">Practice </w:t>
+      </w:r>
+    </w:p>
+    <w:p>
+      <w:pPr>
+        <w:pStyle w:val="ListParagraph"/>
+        <w:numPr>
+          <w:ilvl w:val="0"/>
+          <w:numId w:val="9"/>
+        </w:numPr>
+        <w:spacing w:line="360" w:lineRule="auto"/>
+        <w:jc w:val="both"/>
+        <w:rPr>
+          <w:rFonts w:ascii="Times New Roman" w:hAnsi="Times New Roman"/>
+          <w:sz w:val="28"/>
+          <w:szCs w:val="28"/>
+        </w:rPr>
+      </w:pPr>
+      <w:r>
+        <w:rPr>
+          <w:rFonts w:ascii="Times New Roman" w:hAnsi="Times New Roman"/>
+          <w:sz w:val="28"/>
+          <w:szCs w:val="28"/>
+        </w:rPr>
+        <w:t xml:space="preserve">Test /ask from the interactive </w:t>
+      </w:r>
+      <w:proofErr w:type="gramStart"/>
+      <w:r>
+        <w:rPr>
+          <w:rFonts w:ascii="Times New Roman" w:hAnsi="Times New Roman"/>
+          <w:sz w:val="28"/>
+          <w:szCs w:val="28"/>
+        </w:rPr>
+        <w:t>docs</w:t>
+      </w:r>
+      <w:proofErr w:type="gramEnd"/>
+      <w:r>
+        <w:rPr>
+          <w:rFonts w:ascii="Times New Roman" w:hAnsi="Times New Roman"/>
+          <w:sz w:val="28"/>
+          <w:szCs w:val="28"/>
+        </w:rPr>
+        <w:t xml:space="preserve"> page with a question your documents can </w:t>
+      </w:r>
+      <w:proofErr w:type="gramStart"/>
+      <w:r>
+        <w:rPr>
+          <w:rFonts w:ascii="Times New Roman" w:hAnsi="Times New Roman"/>
+          <w:sz w:val="28"/>
+          <w:szCs w:val="28"/>
+        </w:rPr>
+        <w:t>answer, and</w:t>
+      </w:r>
+      <w:proofErr w:type="gramEnd"/>
+      <w:r>
+        <w:rPr>
+          <w:rFonts w:ascii="Times New Roman" w:hAnsi="Times New Roman"/>
+          <w:sz w:val="28"/>
+          <w:szCs w:val="28"/>
+        </w:rPr>
+        <w:t xml:space="preserve"> confirm the sources field is populated correctly. </w:t>
+      </w:r>
+    </w:p>
+    <w:p>
+      <w:pPr>
+        <w:pStyle w:val="ListParagraph"/>
+        <w:numPr>
+          <w:ilvl w:val="0"/>
+          <w:numId w:val="9"/>
+        </w:numPr>
+        <w:spacing w:line="360" w:lineRule="auto"/>
+        <w:jc w:val="both"/>
+        <w:rPr>
+          <w:rFonts w:ascii="Times New Roman" w:hAnsi="Times New Roman"/>
+          <w:sz w:val="28"/>
+          <w:szCs w:val="28"/>
+        </w:rPr>
+      </w:pPr>
+      <w:r>
+        <w:rPr>
+          <w:rFonts w:ascii="Times New Roman" w:hAnsi="Times New Roman"/>
+          <w:sz w:val="28"/>
+          <w:szCs w:val="28"/>
+        </w:rPr>
+        <w:t>Add a basic try/except around the LLM call so a failed request returns a clean error response instead of crashing the endpoint</w:t>
+      </w:r>
+      <w:r>
+        <w:rPr>
+          <w:rFonts w:ascii="Times New Roman" w:hAnsi="Times New Roman"/>
+          <w:sz w:val="28"/>
+          <w:szCs w:val="28"/>
+        </w:rPr>
+        <w:t>.</w:t>
+      </w:r>
+    </w:p>
+    <w:p>
+      <w:pPr>
+        <w:spacing w:line="360" w:lineRule="auto"/>
+        <w:jc w:val="both"/>
+        <w:rPr>
+          <w:rFonts w:ascii="Times New Roman" w:hAnsi="Times New Roman"/>
+          <w:b/>
+          <w:bCs/>
+          <w:sz w:val="28"/>
+          <w:szCs w:val="28"/>
+        </w:rPr>
+      </w:pPr>
+      <w:r>
+        <w:rPr>
+          <w:rFonts w:ascii="Times New Roman" w:hAnsi="Times New Roman"/>
+          <w:b/>
+          <w:bCs/>
+          <w:sz w:val="28"/>
+          <w:szCs w:val="28"/>
+        </w:rPr>
+        <w:t>Code:</w:t>
+      </w:r>
+    </w:p>
+    <w:p>
+      <w:pPr>
+        <w:spacing w:line="360" w:lineRule="auto"/>
+        <w:jc w:val="both"/>
         <w:rPr>
           <w:rFonts w:ascii="Times New Roman" w:hAnsi="Times New Roman"/>
           <w:b/>
@@ -2483,6 +3061,119 @@
     </w:lvl>
   </w:abstractNum>
   <w:abstractNum w:abstractNumId="2" w15:restartNumberingAfterBreak="0">
+    <w:nsid w:val="107F7C9E"/>
+    <w:multiLevelType w:val="hybridMultilevel"/>
+    <w:tmpl w:val="0BE4A970"/>
+    <w:lvl w:ilvl="0" w:tplc="08090001">
+      <w:start w:val="1"/>
+      <w:numFmt w:val="bullet"/>
+      <w:lvlText w:val=""/>
+      <w:lvlJc w:val="left"/>
+      <w:pPr>
+        <w:ind w:left="720" w:hanging="360"/>
+      </w:pPr>
+      <w:rPr>
+        <w:rFonts w:ascii="Symbol" w:hAnsi="Symbol" w:hint="default"/>
+      </w:rPr>
+    </w:lvl>
+    <w:lvl w:ilvl="1" w:tplc="08090003" w:tentative="1">
+      <w:start w:val="1"/>
+      <w:numFmt w:val="bullet"/>
+      <w:lvlText w:val="o"/>
+      <w:lvlJc w:val="left"/>
+      <w:pPr>
+        <w:ind w:left="1440" w:hanging="360"/>
+      </w:pPr>
+      <w:rPr>
+        <w:rFonts w:ascii="Courier New" w:hAnsi="Courier New" w:cs="Courier New" w:hint="default"/>
+      </w:rPr>
+    </w:lvl>
+    <w:lvl w:ilvl="2" w:tplc="08090005" w:tentative="1">
+      <w:start w:val="1"/>
+      <w:numFmt w:val="bullet"/>
+      <w:lvlText w:val=""/>
+      <w:lvlJc w:val="left"/>
+      <w:pPr>
+        <w:ind w:left="2160" w:hanging="360"/>
+      </w:pPr>
+      <w:rPr>
+        <w:rFonts w:ascii="Wingdings" w:hAnsi="Wingdings" w:hint="default"/>
+      </w:rPr>
+    </w:lvl>
+    <w:lvl w:ilvl="3" w:tplc="08090001" w:tentative="1">
+      <w:start w:val="1"/>
+      <w:numFmt w:val="bullet"/>
+      <w:lvlText w:val=""/>
+      <w:lvlJc w:val="left"/>
+      <w:pPr>
+        <w:ind w:left="2880" w:hanging="360"/>
+      </w:pPr>
+      <w:rPr>
+        <w:rFonts w:ascii="Symbol" w:hAnsi="Symbol" w:hint="default"/>
+      </w:rPr>
+    </w:lvl>
+    <w:lvl w:ilvl="4" w:tplc="08090003" w:tentative="1">
+      <w:start w:val="1"/>
+      <w:numFmt w:val="bullet"/>
+      <w:lvlText w:val="o"/>
+      <w:lvlJc w:val="left"/>
+      <w:pPr>
+        <w:ind w:left="3600" w:hanging="360"/>
+      </w:pPr>
+      <w:rPr>
+        <w:rFonts w:ascii="Courier New" w:hAnsi="Courier New" w:cs="Courier New" w:hint="default"/>
+      </w:rPr>
+    </w:lvl>
+    <w:lvl w:ilvl="5" w:tplc="08090005" w:tentative="1">
+      <w:start w:val="1"/>
+      <w:numFmt w:val="bullet"/>
+      <w:lvlText w:val=""/>
+      <w:lvlJc w:val="left"/>
+      <w:pPr>
+        <w:ind w:left="4320" w:hanging="360"/>
+      </w:pPr>
+      <w:rPr>
+        <w:rFonts w:ascii="Wingdings" w:hAnsi="Wingdings" w:hint="default"/>
+      </w:rPr>
+    </w:lvl>
+    <w:lvl w:ilvl="6" w:tplc="08090001" w:tentative="1">
+      <w:start w:val="1"/>
+      <w:numFmt w:val="bullet"/>
+      <w:lvlText w:val=""/>
+      <w:lvlJc w:val="left"/>
+      <w:pPr>
+        <w:ind w:left="5040" w:hanging="360"/>
+      </w:pPr>
+      <w:rPr>
+        <w:rFonts w:ascii="Symbol" w:hAnsi="Symbol" w:hint="default"/>
+      </w:rPr>
+    </w:lvl>
+    <w:lvl w:ilvl="7" w:tplc="08090003" w:tentative="1">
+      <w:start w:val="1"/>
+      <w:numFmt w:val="bullet"/>
+      <w:lvlText w:val="o"/>
+      <w:lvlJc w:val="left"/>
+      <w:pPr>
+        <w:ind w:left="5760" w:hanging="360"/>
+      </w:pPr>
+      <w:rPr>
+        <w:rFonts w:ascii="Courier New" w:hAnsi="Courier New" w:cs="Courier New" w:hint="default"/>
+      </w:rPr>
+    </w:lvl>
+    <w:lvl w:ilvl="8" w:tplc="08090005" w:tentative="1">
+      <w:start w:val="1"/>
+      <w:numFmt w:val="bullet"/>
+      <w:lvlText w:val=""/>
+      <w:lvlJc w:val="left"/>
+      <w:pPr>
+        <w:ind w:left="6480" w:hanging="360"/>
+      </w:pPr>
+      <w:rPr>
+        <w:rFonts w:ascii="Wingdings" w:hAnsi="Wingdings" w:hint="default"/>
+      </w:rPr>
+    </w:lvl>
+  </w:abstractNum>
+  <w:abstractNum w:abstractNumId="3" w15:restartNumberingAfterBreak="0">
     <w:nsid w:val="111755E6"/>
     <w:multiLevelType w:val="hybridMultilevel"/>
     <w:tmpl w:val="550E4A06"/>
@@ -2595,7 +3286,7 @@
       </w:rPr>
     </w:lvl>
   </w:abstractNum>
-  <w:abstractNum w:abstractNumId="3" w15:restartNumberingAfterBreak="0">
+  <w:abstractNum w:abstractNumId="4" w15:restartNumberingAfterBreak="0">
     <w:nsid w:val="1B065F9B"/>
     <w:multiLevelType w:val="multilevel"/>
     <w:tmpl w:val="28665F9C"/>
@@ -2744,7 +3435,7 @@
       </w:rPr>
     </w:lvl>
   </w:abstractNum>
-  <w:abstractNum w:abstractNumId="4" w15:restartNumberingAfterBreak="0">
+  <w:abstractNum w:abstractNumId="5" w15:restartNumberingAfterBreak="0">
     <w:nsid w:val="2A1B13AB"/>
     <w:multiLevelType w:val="multilevel"/>
     <w:tmpl w:val="67AE19CA"/>
@@ -2893,7 +3584,7 @@
       </w:rPr>
     </w:lvl>
   </w:abstractNum>
-  <w:abstractNum w:abstractNumId="5" w15:restartNumberingAfterBreak="0">
+  <w:abstractNum w:abstractNumId="6" w15:restartNumberingAfterBreak="0">
     <w:nsid w:val="52914AE8"/>
     <w:multiLevelType w:val="hybridMultilevel"/>
     <w:tmpl w:val="E54C16CC"/>
@@ -3006,7 +3697,7 @@
       </w:rPr>
     </w:lvl>
   </w:abstractNum>
-  <w:abstractNum w:abstractNumId="6" w15:restartNumberingAfterBreak="0">
+  <w:abstractNum w:abstractNumId="7" w15:restartNumberingAfterBreak="0">
     <w:nsid w:val="53B9253A"/>
     <w:multiLevelType w:val="hybridMultilevel"/>
     <w:tmpl w:val="B2249C60"/>
@@ -3119,7 +3810,7 @@
       </w:rPr>
     </w:lvl>
   </w:abstractNum>
-  <w:abstractNum w:abstractNumId="7" w15:restartNumberingAfterBreak="0">
+  <w:abstractNum w:abstractNumId="8" w15:restartNumberingAfterBreak="0">
     <w:nsid w:val="640F6BA6"/>
     <w:multiLevelType w:val="multilevel"/>
     <w:tmpl w:val="22C40E7C"/>
@@ -3272,25 +3963,28 @@
     <w:abstractNumId w:val="1"/>
   </w:num>
   <w:num w:numId="2" w16cid:durableId="24991271">
-    <w:abstractNumId w:val="7"/>
+    <w:abstractNumId w:val="8"/>
   </w:num>
   <w:num w:numId="3" w16cid:durableId="1786003353">
-    <w:abstractNumId w:val="2"/>
+    <w:abstractNumId w:val="3"/>
   </w:num>
   <w:num w:numId="4" w16cid:durableId="1085958076">
-    <w:abstractNumId w:val="5"/>
+    <w:abstractNumId w:val="6"/>
   </w:num>
   <w:num w:numId="5" w16cid:durableId="99495999">
     <w:abstractNumId w:val="0"/>
   </w:num>
   <w:num w:numId="6" w16cid:durableId="1350836733">
+    <w:abstractNumId w:val="5"/>
+  </w:num>
+  <w:num w:numId="7" w16cid:durableId="522400444">
     <w:abstractNumId w:val="4"/>
   </w:num>
-  <w:num w:numId="7" w16cid:durableId="522400444">
-    <w:abstractNumId w:val="3"/>
+  <w:num w:numId="8" w16cid:durableId="2101556632">
+    <w:abstractNumId w:val="7"/>
   </w:num>
-  <w:num w:numId="8" w16cid:durableId="2101556632">
-    <w:abstractNumId w:val="6"/>
+  <w:num w:numId="9" w16cid:durableId="1897273228">
+    <w:abstractNumId w:val="2"/>
   </w:num>
 </w:numbering>
 </file>

</xml_diff>